<commit_message>
kubernetes - daemonset updated
</commit_message>
<xml_diff>
--- a/Kubernetes/8-daemonset-a4.docx
+++ b/Kubernetes/8-daemonset-a4.docx
@@ -1,6 +1,6 @@
 
 <file path=word/document.xml><?xml version="1.0" encoding="utf-8"?>
-<w:document xmlns:wpc="http://schemas.microsoft.com/office/word/2010/wordprocessingCanvas" xmlns:cx="http://schemas.microsoft.com/office/drawing/2014/chartex" xmlns:cx1="http://schemas.microsoft.com/office/drawing/2015/9/8/chartex" xmlns:cx2="http://schemas.microsoft.com/office/drawing/2015/10/21/chartex" xmlns:cx3="http://schemas.microsoft.com/office/drawing/2016/5/9/chartex" xmlns:cx4="http://schemas.microsoft.com/office/drawing/2016/5/10/chartex" xmlns:cx5="http://schemas.microsoft.com/office/drawing/2016/5/11/chartex" xmlns:cx6="http://schemas.microsoft.com/office/drawing/2016/5/12/chartex" xmlns:cx7="http://schemas.microsoft.com/office/drawing/2016/5/13/chartex" xmlns:cx8="http://schemas.microsoft.com/office/drawing/2016/5/14/chartex" xmlns:mc="http://schemas.openxmlformats.org/markup-compatibility/2006" xmlns:aink="http://schemas.microsoft.com/office/drawing/2016/ink" xmlns:am3d="http://schemas.microsoft.com/office/drawing/2017/model3d" xmlns:o="urn:schemas-microsoft-com:office:office" xmlns:oel="http://schemas.microsoft.com/office/2019/extlst" xmlns:r="http://schemas.openxmlformats.org/officeDocument/2006/relationships" xmlns:m="http://schemas.openxmlformats.org/officeDocument/2006/math" xmlns:v="urn:schemas-microsoft-com:vml" xmlns:wp14="http://schemas.microsoft.com/office/word/2010/wordprocessingDrawing" xmlns:wp="http://schemas.openxmlformats.org/drawingml/2006/wordprocessingDrawing" xmlns:w10="urn:schemas-microsoft-com:office:word" xmlns:w="http://schemas.openxmlformats.org/wordprocessingml/2006/main" xmlns:w14="http://schemas.microsoft.com/office/word/2010/wordml" xmlns:w15="http://schemas.microsoft.com/office/word/2012/wordml" xmlns:w16cex="http://schemas.microsoft.com/office/word/2018/wordml/cex" xmlns:w16cid="http://schemas.microsoft.com/office/word/2016/wordml/cid" xmlns:w16="http://schemas.microsoft.com/office/word/2018/wordml" xmlns:w16sdtdh="http://schemas.microsoft.com/office/word/2020/wordml/sdtdatahash" xmlns:w16se="http://schemas.microsoft.com/office/word/2015/wordml/symex" xmlns:wpg="http://schemas.microsoft.com/office/word/2010/wordprocessingGroup" xmlns:wpi="http://schemas.microsoft.com/office/word/2010/wordprocessingInk" xmlns:wne="http://schemas.microsoft.com/office/word/2006/wordml" xmlns:wps="http://schemas.microsoft.com/office/word/2010/wordprocessingShape" mc:Ignorable="w14 w15 w16se w16cid w16 w16cex w16sdtdh wp14">
+<w:document xmlns:wpc="http://schemas.microsoft.com/office/word/2010/wordprocessingCanvas" xmlns:cx="http://schemas.microsoft.com/office/drawing/2014/chartex" xmlns:cx1="http://schemas.microsoft.com/office/drawing/2015/9/8/chartex" xmlns:cx2="http://schemas.microsoft.com/office/drawing/2015/10/21/chartex" xmlns:cx3="http://schemas.microsoft.com/office/drawing/2016/5/9/chartex" xmlns:cx4="http://schemas.microsoft.com/office/drawing/2016/5/10/chartex" xmlns:cx5="http://schemas.microsoft.com/office/drawing/2016/5/11/chartex" xmlns:cx6="http://schemas.microsoft.com/office/drawing/2016/5/12/chartex" xmlns:cx7="http://schemas.microsoft.com/office/drawing/2016/5/13/chartex" xmlns:cx8="http://schemas.microsoft.com/office/drawing/2016/5/14/chartex" xmlns:mc="http://schemas.openxmlformats.org/markup-compatibility/2006" xmlns:aink="http://schemas.microsoft.com/office/drawing/2016/ink" xmlns:am3d="http://schemas.microsoft.com/office/drawing/2017/model3d" xmlns:o="urn:schemas-microsoft-com:office:office" xmlns:oel="http://schemas.microsoft.com/office/2019/extlst" xmlns:r="http://schemas.openxmlformats.org/officeDocument/2006/relationships" xmlns:m="http://schemas.openxmlformats.org/officeDocument/2006/math" xmlns:v="urn:schemas-microsoft-com:vml" xmlns:wp14="http://schemas.microsoft.com/office/word/2010/wordprocessingDrawing" xmlns:wp="http://schemas.openxmlformats.org/drawingml/2006/wordprocessingDrawing" xmlns:w10="urn:schemas-microsoft-com:office:word" xmlns:w="http://schemas.openxmlformats.org/wordprocessingml/2006/main" xmlns:w14="http://schemas.microsoft.com/office/word/2010/wordml" xmlns:w15="http://schemas.microsoft.com/office/word/2012/wordml" xmlns:w16cex="http://schemas.microsoft.com/office/word/2018/wordml/cex" xmlns:w16cid="http://schemas.microsoft.com/office/word/2016/wordml/cid" xmlns:w16="http://schemas.microsoft.com/office/word/2018/wordml" xmlns:w16du="http://schemas.microsoft.com/office/word/2023/wordml/word16du" xmlns:w16sdtdh="http://schemas.microsoft.com/office/word/2020/wordml/sdtdatahash" xmlns:w16sdtfl="http://schemas.microsoft.com/office/word/2024/wordml/sdtformatlock" xmlns:w16se="http://schemas.microsoft.com/office/word/2015/wordml/symex" xmlns:wpg="http://schemas.microsoft.com/office/word/2010/wordprocessingGroup" xmlns:wpi="http://schemas.microsoft.com/office/word/2010/wordprocessingInk" xmlns:wne="http://schemas.microsoft.com/office/word/2006/wordml" xmlns:wps="http://schemas.microsoft.com/office/word/2010/wordprocessingShape" mc:Ignorable="w14 w15 w16se w16cid w16 w16cex w16sdtdh w16sdtfl w16du wp14">
   <w:body>
     <w:p>
       <w:pPr>
@@ -27,7 +27,7 @@
     </w:p>
     <w:p>
       <w:pPr>
-        <w:spacing w:after="120"/>
+        <w:spacing w:after="80"/>
         <w:jc w:val="both"/>
         <w:rPr>
           <w:rFonts w:asciiTheme="majorBidi" w:hAnsiTheme="majorBidi" w:cstheme="majorBidi"/>
@@ -140,7 +140,7 @@
     </w:p>
     <w:p>
       <w:pPr>
-        <w:spacing w:after="120"/>
+        <w:spacing w:after="80"/>
         <w:rPr>
           <w:rFonts w:asciiTheme="majorBidi" w:hAnsiTheme="majorBidi" w:cstheme="majorBidi"/>
           <w:sz w:val="28"/>
@@ -322,7 +322,7 @@
     </w:p>
     <w:p>
       <w:pPr>
-        <w:spacing w:after="120"/>
+        <w:spacing w:after="80"/>
         <w:rPr>
           <w:rFonts w:asciiTheme="majorBidi" w:hAnsiTheme="majorBidi" w:cstheme="majorBidi"/>
           <w:sz w:val="28"/>
@@ -362,7 +362,7 @@
     </w:p>
     <w:p>
       <w:pPr>
-        <w:spacing w:after="60"/>
+        <w:spacing w:after="40"/>
         <w:rPr>
           <w:rFonts w:asciiTheme="majorBidi" w:hAnsiTheme="majorBidi" w:cstheme="majorBidi"/>
           <w:sz w:val="28"/>
@@ -476,7 +476,7 @@
     </w:p>
     <w:p>
       <w:pPr>
-        <w:spacing w:after="120"/>
+        <w:spacing w:after="60"/>
         <w:rPr>
           <w:rFonts w:asciiTheme="majorBidi" w:hAnsiTheme="majorBidi" w:cstheme="majorBidi"/>
           <w:b/>
@@ -572,29 +572,7 @@
           <w:sz w:val="32"/>
           <w:szCs w:val="32"/>
         </w:rPr>
-        <w:t xml:space="preserve">Example </w:t>
-      </w:r>
-      <w:proofErr w:type="spellStart"/>
-      <w:r>
-        <w:rPr>
-          <w:rFonts w:asciiTheme="majorBidi" w:hAnsiTheme="majorBidi" w:cstheme="majorBidi"/>
-          <w:b/>
-          <w:bCs/>
-          <w:sz w:val="32"/>
-          <w:szCs w:val="32"/>
-        </w:rPr>
-        <w:t>DaemonSet</w:t>
-      </w:r>
-      <w:proofErr w:type="spellEnd"/>
-      <w:r>
-        <w:rPr>
-          <w:rFonts w:asciiTheme="majorBidi" w:hAnsiTheme="majorBidi" w:cstheme="majorBidi"/>
-          <w:b/>
-          <w:bCs/>
-          <w:sz w:val="32"/>
-          <w:szCs w:val="32"/>
-        </w:rPr>
-        <w:t xml:space="preserve"> YAML</w:t>
+        <w:t>Example DaemonSet YAML</w:t>
       </w:r>
     </w:p>
     <w:p>
@@ -617,15 +595,15 @@
         <mc:AlternateContent>
           <mc:Choice Requires="wps">
             <w:drawing>
-              <wp:anchor distT="0" distB="0" distL="114300" distR="114300" simplePos="0" relativeHeight="251659264" behindDoc="0" locked="0" layoutInCell="1" allowOverlap="1" wp14:anchorId="320A3E73" wp14:editId="507E3E17">
+              <wp:anchor distT="0" distB="0" distL="114300" distR="114300" simplePos="0" relativeHeight="251659264" behindDoc="0" locked="0" layoutInCell="1" allowOverlap="1" wp14:anchorId="320A3E73" wp14:editId="5DAD7F7B">
                 <wp:simplePos x="0" y="0"/>
                 <wp:positionH relativeFrom="column">
-                  <wp:posOffset>-19050</wp:posOffset>
+                  <wp:posOffset>-15240</wp:posOffset>
                 </wp:positionH>
                 <wp:positionV relativeFrom="paragraph">
-                  <wp:posOffset>31750</wp:posOffset>
+                  <wp:posOffset>34925</wp:posOffset>
                 </wp:positionV>
-                <wp:extent cx="2499360" cy="3219450"/>
+                <wp:extent cx="2499360" cy="3352800"/>
                 <wp:effectExtent l="0" t="0" r="15240" b="19050"/>
                 <wp:wrapNone/>
                 <wp:docPr id="1458031134" name="Rectangle 1"/>
@@ -637,7 +615,7 @@
                       <wps:spPr>
                         <a:xfrm>
                           <a:off x="0" y="0"/>
-                          <a:ext cx="2499360" cy="3219450"/>
+                          <a:ext cx="2499360" cy="3352800"/>
                         </a:xfrm>
                         <a:prstGeom prst="rect">
                           <a:avLst/>
@@ -1148,6 +1126,44 @@
                                 <w:szCs w:val="28"/>
                               </w:rPr>
                             </w:pPr>
+                            <w:r>
+                              <w:rPr>
+                                <w:rFonts w:asciiTheme="majorBidi" w:hAnsiTheme="majorBidi" w:cstheme="majorBidi"/>
+                                <w:b/>
+                                <w:bCs/>
+                                <w:i/>
+                                <w:iCs/>
+                                <w:sz w:val="28"/>
+                                <w:szCs w:val="28"/>
+                              </w:rPr>
+                              <w:t xml:space="preserve">               </w:t>
+                            </w:r>
+                            <w:r>
+                              <w:rPr>
+                                <w:rFonts w:asciiTheme="majorBidi" w:hAnsiTheme="majorBidi" w:cstheme="majorBidi"/>
+                                <w:b/>
+                                <w:bCs/>
+                                <w:i/>
+                                <w:iCs/>
+                                <w:sz w:val="28"/>
+                                <w:szCs w:val="28"/>
+                              </w:rPr>
+                              <w:t>containers:</w:t>
+                            </w:r>
+                          </w:p>
+                          <w:p>
+                            <w:pPr>
+                              <w:spacing w:after="0"/>
+                              <w:rPr>
+                                <w:rFonts w:asciiTheme="majorBidi" w:hAnsiTheme="majorBidi" w:cstheme="majorBidi"/>
+                                <w:b/>
+                                <w:bCs/>
+                                <w:i/>
+                                <w:iCs/>
+                                <w:sz w:val="28"/>
+                                <w:szCs w:val="28"/>
+                              </w:rPr>
+                            </w:pPr>
                           </w:p>
                           <w:p>
                             <w:pPr>
@@ -1183,7 +1199,7 @@
           </mc:Choice>
           <mc:Fallback>
             <w:pict>
-              <v:rect w14:anchorId="320A3E73" id="Rectangle 1" o:spid="_x0000_s1026" style="position:absolute;margin-left:-1.5pt;margin-top:2.5pt;width:196.8pt;height:253.5pt;z-index:251659264;visibility:visible;mso-wrap-style:square;mso-width-percent:0;mso-height-percent:0;mso-wrap-distance-left:9pt;mso-wrap-distance-top:0;mso-wrap-distance-right:9pt;mso-wrap-distance-bottom:0;mso-position-horizontal:absolute;mso-position-horizontal-relative:text;mso-position-vertical:absolute;mso-position-vertical-relative:text;mso-width-percent:0;mso-height-percent:0;mso-width-relative:margin;mso-height-relative:margin;v-text-anchor:middle" o:gfxdata="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" fillcolor="black [3200]" strokecolor="black [480]" strokeweight="1pt">
+              <v:rect w14:anchorId="320A3E73" id="Rectangle 1" o:spid="_x0000_s1026" style="position:absolute;margin-left:-1.2pt;margin-top:2.75pt;width:196.8pt;height:264pt;z-index:251659264;visibility:visible;mso-wrap-style:square;mso-width-percent:0;mso-height-percent:0;mso-wrap-distance-left:9pt;mso-wrap-distance-top:0;mso-wrap-distance-right:9pt;mso-wrap-distance-bottom:0;mso-position-horizontal:absolute;mso-position-horizontal-relative:text;mso-position-vertical:absolute;mso-position-vertical-relative:text;mso-width-percent:0;mso-height-percent:0;mso-width-relative:margin;mso-height-relative:margin;v-text-anchor:middle" o:gfxdata="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" fillcolor="black [3200]" strokecolor="black [480]" strokeweight="1pt">
                 <v:textbox>
                   <w:txbxContent>
                     <w:p>
@@ -1673,6 +1689,44 @@
                           <w:szCs w:val="28"/>
                         </w:rPr>
                       </w:pPr>
+                      <w:r>
+                        <w:rPr>
+                          <w:rFonts w:asciiTheme="majorBidi" w:hAnsiTheme="majorBidi" w:cstheme="majorBidi"/>
+                          <w:b/>
+                          <w:bCs/>
+                          <w:i/>
+                          <w:iCs/>
+                          <w:sz w:val="28"/>
+                          <w:szCs w:val="28"/>
+                        </w:rPr>
+                        <w:t xml:space="preserve">               </w:t>
+                      </w:r>
+                      <w:r>
+                        <w:rPr>
+                          <w:rFonts w:asciiTheme="majorBidi" w:hAnsiTheme="majorBidi" w:cstheme="majorBidi"/>
+                          <w:b/>
+                          <w:bCs/>
+                          <w:i/>
+                          <w:iCs/>
+                          <w:sz w:val="28"/>
+                          <w:szCs w:val="28"/>
+                        </w:rPr>
+                        <w:t>containers:</w:t>
+                      </w:r>
+                    </w:p>
+                    <w:p>
+                      <w:pPr>
+                        <w:spacing w:after="0"/>
+                        <w:rPr>
+                          <w:rFonts w:asciiTheme="majorBidi" w:hAnsiTheme="majorBidi" w:cstheme="majorBidi"/>
+                          <w:b/>
+                          <w:bCs/>
+                          <w:i/>
+                          <w:iCs/>
+                          <w:sz w:val="28"/>
+                          <w:szCs w:val="28"/>
+                        </w:rPr>
+                      </w:pPr>
                     </w:p>
                     <w:p>
                       <w:pPr>
@@ -1794,7 +1848,7 @@
         <mc:AlternateContent>
           <mc:Choice Requires="wps">
             <w:drawing>
-              <wp:anchor distT="0" distB="0" distL="114300" distR="114300" simplePos="0" relativeHeight="251660288" behindDoc="0" locked="0" layoutInCell="1" allowOverlap="1" wp14:anchorId="3839FAB4" wp14:editId="62CB2385">
+              <wp:anchor distT="0" distB="0" distL="114300" distR="114300" simplePos="0" relativeHeight="251660288" behindDoc="0" locked="0" layoutInCell="1" allowOverlap="1" wp14:anchorId="3839FAB4" wp14:editId="6A9AF5FA">
                 <wp:simplePos x="0" y="0"/>
                 <wp:positionH relativeFrom="margin">
                   <wp:align>left</wp:align>
@@ -1802,8 +1856,8 @@
                 <wp:positionV relativeFrom="paragraph">
                   <wp:posOffset>2540</wp:posOffset>
                 </wp:positionV>
-                <wp:extent cx="3116580" cy="1333500"/>
-                <wp:effectExtent l="0" t="0" r="26670" b="19050"/>
+                <wp:extent cx="3116580" cy="1036320"/>
+                <wp:effectExtent l="0" t="0" r="26670" b="11430"/>
                 <wp:wrapNone/>
                 <wp:docPr id="99147539" name="Rectangle 2"/>
                 <wp:cNvGraphicFramePr/>
@@ -1814,7 +1868,7 @@
                       <wps:spPr>
                         <a:xfrm>
                           <a:off x="0" y="0"/>
-                          <a:ext cx="3116580" cy="1333500"/>
+                          <a:ext cx="3116580" cy="1036320"/>
                         </a:xfrm>
                         <a:prstGeom prst="rect">
                           <a:avLst/>
@@ -1838,44 +1892,6 @@
                       </wps:style>
                       <wps:txbx>
                         <w:txbxContent>
-                          <w:p>
-                            <w:pPr>
-                              <w:spacing w:after="0"/>
-                              <w:rPr>
-                                <w:rFonts w:asciiTheme="majorBidi" w:hAnsiTheme="majorBidi" w:cstheme="majorBidi"/>
-                                <w:b/>
-                                <w:bCs/>
-                                <w:i/>
-                                <w:iCs/>
-                                <w:sz w:val="28"/>
-                                <w:szCs w:val="28"/>
-                              </w:rPr>
-                            </w:pPr>
-                            <w:r>
-                              <w:rPr>
-                                <w:rFonts w:asciiTheme="majorBidi" w:hAnsiTheme="majorBidi" w:cstheme="majorBidi"/>
-                                <w:b/>
-                                <w:bCs/>
-                                <w:i/>
-                                <w:iCs/>
-                                <w:sz w:val="28"/>
-                                <w:szCs w:val="28"/>
-                              </w:rPr>
-                              <w:t xml:space="preserve">               </w:t>
-                            </w:r>
-                            <w:r>
-                              <w:rPr>
-                                <w:rFonts w:asciiTheme="majorBidi" w:hAnsiTheme="majorBidi" w:cstheme="majorBidi"/>
-                                <w:b/>
-                                <w:bCs/>
-                                <w:i/>
-                                <w:iCs/>
-                                <w:sz w:val="28"/>
-                                <w:szCs w:val="28"/>
-                              </w:rPr>
-                              <w:t>containers:</w:t>
-                            </w:r>
-                          </w:p>
                           <w:p>
                             <w:pPr>
                               <w:spacing w:after="0"/>
@@ -2099,47 +2115,9 @@
           </mc:Choice>
           <mc:Fallback>
             <w:pict>
-              <v:rect w14:anchorId="3839FAB4" id="Rectangle 2" o:spid="_x0000_s1027" style="position:absolute;margin-left:0;margin-top:.2pt;width:245.4pt;height:105pt;z-index:251660288;visibility:visible;mso-wrap-style:square;mso-width-percent:0;mso-height-percent:0;mso-wrap-distance-left:9pt;mso-wrap-distance-top:0;mso-wrap-distance-right:9pt;mso-wrap-distance-bottom:0;mso-position-horizontal:left;mso-position-horizontal-relative:margin;mso-position-vertical:absolute;mso-position-vertical-relative:text;mso-width-percent:0;mso-height-percent:0;mso-width-relative:margin;mso-height-relative:margin;v-text-anchor:middle" o:gfxdata="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" fillcolor="black [3200]" strokecolor="black [480]" strokeweight="1pt">
+              <v:rect w14:anchorId="3839FAB4" id="Rectangle 2" o:spid="_x0000_s1027" style="position:absolute;margin-left:0;margin-top:.2pt;width:245.4pt;height:81.6pt;z-index:251660288;visibility:visible;mso-wrap-style:square;mso-width-percent:0;mso-height-percent:0;mso-wrap-distance-left:9pt;mso-wrap-distance-top:0;mso-wrap-distance-right:9pt;mso-wrap-distance-bottom:0;mso-position-horizontal:left;mso-position-horizontal-relative:margin;mso-position-vertical:absolute;mso-position-vertical-relative:text;mso-width-percent:0;mso-height-percent:0;mso-width-relative:margin;mso-height-relative:margin;v-text-anchor:middle" o:gfxdata="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" fillcolor="black [3200]" strokecolor="black [480]" strokeweight="1pt">
                 <v:textbox>
                   <w:txbxContent>
-                    <w:p>
-                      <w:pPr>
-                        <w:spacing w:after="0"/>
-                        <w:rPr>
-                          <w:rFonts w:asciiTheme="majorBidi" w:hAnsiTheme="majorBidi" w:cstheme="majorBidi"/>
-                          <w:b/>
-                          <w:bCs/>
-                          <w:i/>
-                          <w:iCs/>
-                          <w:sz w:val="28"/>
-                          <w:szCs w:val="28"/>
-                        </w:rPr>
-                      </w:pPr>
-                      <w:r>
-                        <w:rPr>
-                          <w:rFonts w:asciiTheme="majorBidi" w:hAnsiTheme="majorBidi" w:cstheme="majorBidi"/>
-                          <w:b/>
-                          <w:bCs/>
-                          <w:i/>
-                          <w:iCs/>
-                          <w:sz w:val="28"/>
-                          <w:szCs w:val="28"/>
-                        </w:rPr>
-                        <w:t xml:space="preserve">               </w:t>
-                      </w:r>
-                      <w:r>
-                        <w:rPr>
-                          <w:rFonts w:asciiTheme="majorBidi" w:hAnsiTheme="majorBidi" w:cstheme="majorBidi"/>
-                          <w:b/>
-                          <w:bCs/>
-                          <w:i/>
-                          <w:iCs/>
-                          <w:sz w:val="28"/>
-                          <w:szCs w:val="28"/>
-                        </w:rPr>
-                        <w:t>containers:</w:t>
-                      </w:r>
-                    </w:p>
                     <w:p>
                       <w:pPr>
                         <w:spacing w:after="0"/>
@@ -2361,29 +2339,11 @@
     </w:p>
     <w:p>
       <w:pPr>
-        <w:rPr>
-          <w:rFonts w:asciiTheme="majorBidi" w:hAnsiTheme="majorBidi" w:cstheme="majorBidi"/>
-          <w:sz w:val="28"/>
-          <w:szCs w:val="28"/>
-        </w:rPr>
-      </w:pPr>
-    </w:p>
-    <w:p>
-      <w:pPr>
-        <w:rPr>
-          <w:rFonts w:asciiTheme="majorBidi" w:hAnsiTheme="majorBidi" w:cstheme="majorBidi"/>
-          <w:sz w:val="2"/>
-          <w:szCs w:val="2"/>
-        </w:rPr>
-      </w:pPr>
-    </w:p>
-    <w:p>
-      <w:pPr>
         <w:spacing w:after="60"/>
         <w:rPr>
           <w:rFonts w:asciiTheme="majorBidi" w:hAnsiTheme="majorBidi" w:cstheme="majorBidi"/>
-          <w:sz w:val="28"/>
-          <w:szCs w:val="28"/>
+          <w:sz w:val="40"/>
+          <w:szCs w:val="40"/>
         </w:rPr>
       </w:pPr>
     </w:p>
@@ -2496,6 +2456,8 @@
         <w:ind w:left="360"/>
         <w:rPr>
           <w:rFonts w:asciiTheme="majorBidi" w:hAnsiTheme="majorBidi" w:cstheme="majorBidi"/>
+          <w:b/>
+          <w:bCs/>
           <w:sz w:val="28"/>
           <w:szCs w:val="28"/>
         </w:rPr>
@@ -2504,6 +2466,8 @@
       <w:r>
         <w:rPr>
           <w:rFonts w:asciiTheme="majorBidi" w:hAnsiTheme="majorBidi" w:cstheme="majorBidi"/>
+          <w:b/>
+          <w:bCs/>
           <w:sz w:val="28"/>
           <w:szCs w:val="28"/>
         </w:rPr>
@@ -2522,6 +2486,8 @@
         <w:ind w:left="360"/>
         <w:rPr>
           <w:rFonts w:asciiTheme="majorBidi" w:hAnsiTheme="majorBidi" w:cstheme="majorBidi"/>
+          <w:b/>
+          <w:bCs/>
           <w:sz w:val="28"/>
           <w:szCs w:val="28"/>
         </w:rPr>
@@ -2530,6 +2496,8 @@
       <w:r>
         <w:rPr>
           <w:rFonts w:asciiTheme="majorBidi" w:hAnsiTheme="majorBidi" w:cstheme="majorBidi"/>
+          <w:b/>
+          <w:bCs/>
           <w:sz w:val="28"/>
           <w:szCs w:val="28"/>
         </w:rPr>
@@ -2548,13 +2516,17 @@
         <w:ind w:left="360"/>
         <w:rPr>
           <w:rFonts w:asciiTheme="majorBidi" w:hAnsiTheme="majorBidi" w:cstheme="majorBidi"/>
-          <w:sz w:val="28"/>
-          <w:szCs w:val="28"/>
-        </w:rPr>
-      </w:pPr>
-      <w:r>
-        <w:rPr>
-          <w:rFonts w:asciiTheme="majorBidi" w:hAnsiTheme="majorBidi" w:cstheme="majorBidi"/>
+          <w:b/>
+          <w:bCs/>
+          <w:sz w:val="28"/>
+          <w:szCs w:val="28"/>
+        </w:rPr>
+      </w:pPr>
+      <w:r>
+        <w:rPr>
+          <w:rFonts w:asciiTheme="majorBidi" w:hAnsiTheme="majorBidi" w:cstheme="majorBidi"/>
+          <w:b/>
+          <w:bCs/>
           <w:sz w:val="28"/>
           <w:szCs w:val="28"/>
         </w:rPr>
@@ -2579,16 +2551,16 @@
         <mc:AlternateContent>
           <mc:Choice Requires="wps">
             <w:drawing>
-              <wp:anchor distT="0" distB="0" distL="114300" distR="114300" simplePos="0" relativeHeight="251661312" behindDoc="0" locked="0" layoutInCell="1" allowOverlap="1" wp14:anchorId="6313A72C" wp14:editId="49591EF8">
+              <wp:anchor distT="0" distB="0" distL="114300" distR="114300" simplePos="0" relativeHeight="251661312" behindDoc="0" locked="0" layoutInCell="1" allowOverlap="1" wp14:anchorId="6313A72C" wp14:editId="06633670">
                 <wp:simplePos x="0" y="0"/>
                 <wp:positionH relativeFrom="column">
                   <wp:posOffset>7620</wp:posOffset>
                 </wp:positionH>
                 <wp:positionV relativeFrom="paragraph">
-                  <wp:posOffset>313055</wp:posOffset>
+                  <wp:posOffset>265430</wp:posOffset>
                 </wp:positionV>
-                <wp:extent cx="1836420" cy="563880"/>
-                <wp:effectExtent l="0" t="0" r="11430" b="26670"/>
+                <wp:extent cx="1836420" cy="556260"/>
+                <wp:effectExtent l="0" t="0" r="11430" b="15240"/>
                 <wp:wrapNone/>
                 <wp:docPr id="635798353" name="Rectangle 3"/>
                 <wp:cNvGraphicFramePr/>
@@ -2599,7 +2571,7 @@
                       <wps:spPr>
                         <a:xfrm>
                           <a:off x="0" y="0"/>
-                          <a:ext cx="1836420" cy="563880"/>
+                          <a:ext cx="1836420" cy="556260"/>
                         </a:xfrm>
                         <a:prstGeom prst="rect">
                           <a:avLst/>
@@ -2735,7 +2707,7 @@
           </mc:Choice>
           <mc:Fallback>
             <w:pict>
-              <v:rect w14:anchorId="6313A72C" id="Rectangle 3" o:spid="_x0000_s1028" style="position:absolute;margin-left:.6pt;margin-top:24.65pt;width:144.6pt;height:44.4pt;z-index:251661312;visibility:visible;mso-wrap-style:square;mso-width-percent:0;mso-height-percent:0;mso-wrap-distance-left:9pt;mso-wrap-distance-top:0;mso-wrap-distance-right:9pt;mso-wrap-distance-bottom:0;mso-position-horizontal:absolute;mso-position-horizontal-relative:text;mso-position-vertical:absolute;mso-position-vertical-relative:text;mso-width-percent:0;mso-height-percent:0;mso-width-relative:margin;mso-height-relative:margin;v-text-anchor:middle" o:gfxdata="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" fillcolor="black [3200]" strokecolor="black [480]" strokeweight="1pt">
+              <v:rect w14:anchorId="6313A72C" id="Rectangle 3" o:spid="_x0000_s1028" style="position:absolute;margin-left:.6pt;margin-top:20.9pt;width:144.6pt;height:43.8pt;z-index:251661312;visibility:visible;mso-wrap-style:square;mso-width-percent:0;mso-height-percent:0;mso-wrap-distance-left:9pt;mso-wrap-distance-top:0;mso-wrap-distance-right:9pt;mso-wrap-distance-bottom:0;mso-position-horizontal:absolute;mso-position-horizontal-relative:text;mso-position-vertical:absolute;mso-position-vertical-relative:text;mso-width-percent:0;mso-height-percent:0;mso-width-relative:margin;mso-height-relative:margin;v-text-anchor:middle" o:gfxdata="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" fillcolor="black [3200]" strokecolor="black [480]" strokeweight="1pt">
                 <v:textbox>
                   <w:txbxContent>
                     <w:p>
@@ -2886,8 +2858,8 @@
       <w:pPr>
         <w:rPr>
           <w:rFonts w:asciiTheme="majorBidi" w:hAnsiTheme="majorBidi" w:cstheme="majorBidi"/>
-          <w:sz w:val="20"/>
-          <w:szCs w:val="20"/>
+          <w:sz w:val="12"/>
+          <w:szCs w:val="12"/>
         </w:rPr>
       </w:pPr>
     </w:p>
@@ -3611,7 +3583,11 @@
           <w:szCs w:val="40"/>
         </w:rPr>
       </w:pPr>
-      <w:r>
+    </w:p>
+    <w:p>
+      <w:pPr>
+        <w:spacing w:after="60"/>
+        <w:jc w:val="both"/>
         <w:rPr>
           <w:rFonts w:asciiTheme="majorBidi" w:hAnsiTheme="majorBidi" w:cstheme="majorBidi"/>
           <w:b/>
@@ -3619,12 +3595,22 @@
           <w:sz w:val="40"/>
           <w:szCs w:val="40"/>
         </w:rPr>
+      </w:pPr>
+      <w:r>
+        <w:rPr>
+          <w:rFonts w:asciiTheme="majorBidi" w:hAnsiTheme="majorBidi" w:cstheme="majorBidi"/>
+          <w:b/>
+          <w:bCs/>
+          <w:sz w:val="40"/>
+          <w:szCs w:val="40"/>
+        </w:rPr>
         <w:lastRenderedPageBreak/>
         <w:t>Updating Strategy</w:t>
       </w:r>
     </w:p>
     <w:p>
       <w:pPr>
+        <w:spacing w:after="60"/>
         <w:jc w:val="both"/>
         <w:rPr>
           <w:rFonts w:asciiTheme="majorBidi" w:hAnsiTheme="majorBidi" w:cstheme="majorBidi"/>
@@ -3661,6 +3647,7 @@
     </w:p>
     <w:p>
       <w:pPr>
+        <w:spacing w:after="60"/>
         <w:jc w:val="both"/>
         <w:rPr>
           <w:rFonts w:asciiTheme="majorBidi" w:hAnsiTheme="majorBidi" w:cstheme="majorBidi"/>
@@ -3860,7 +3847,27 @@
           <w:sz w:val="28"/>
           <w:szCs w:val="28"/>
         </w:rPr>
-        <w:t>A new Pod with the updated spec is created.</w:t>
+        <w:t xml:space="preserve">A new Pod with the updated </w:t>
+      </w:r>
+      <w:r>
+        <w:rPr>
+          <w:rFonts w:asciiTheme="majorBidi" w:hAnsiTheme="majorBidi" w:cstheme="majorBidi"/>
+          <w:b/>
+          <w:bCs/>
+          <w:i/>
+          <w:iCs/>
+          <w:sz w:val="28"/>
+          <w:szCs w:val="28"/>
+        </w:rPr>
+        <w:t>spec</w:t>
+      </w:r>
+      <w:r>
+        <w:rPr>
+          <w:rFonts w:asciiTheme="majorBidi" w:hAnsiTheme="majorBidi" w:cstheme="majorBidi"/>
+          <w:sz w:val="28"/>
+          <w:szCs w:val="28"/>
+        </w:rPr>
+        <w:t xml:space="preserve"> is created.</w:t>
       </w:r>
     </w:p>
     <w:p>
@@ -4277,7 +4284,7 @@
     </w:p>
     <w:p>
       <w:pPr>
-        <w:spacing w:after="120"/>
+        <w:spacing w:after="80"/>
         <w:ind w:left="360"/>
         <w:jc w:val="both"/>
         <w:rPr>
@@ -4960,7 +4967,7 @@
     </w:p>
     <w:p>
       <w:pPr>
-        <w:spacing w:after="120"/>
+        <w:spacing w:after="80"/>
         <w:ind w:left="360"/>
         <w:jc w:val="both"/>
         <w:rPr>
@@ -5153,6 +5160,10 @@
       <w:r>
         <w:rPr>
           <w:rFonts w:asciiTheme="majorBidi" w:hAnsiTheme="majorBidi" w:cstheme="majorBidi"/>
+          <w:b/>
+          <w:bCs/>
+          <w:i/>
+          <w:iCs/>
           <w:sz w:val="28"/>
           <w:szCs w:val="28"/>
         </w:rPr>
@@ -5240,7 +5251,6 @@
           <w:sz w:val="28"/>
           <w:szCs w:val="28"/>
         </w:rPr>
-        <w:lastRenderedPageBreak/>
         <w:t>New Pod is created</w:t>
       </w:r>
     </w:p>
@@ -5262,6 +5272,7 @@
           <w:sz w:val="28"/>
           <w:szCs w:val="28"/>
         </w:rPr>
+        <w:lastRenderedPageBreak/>
         <w:t>So</w:t>
       </w:r>
       <w:proofErr w:type="gramEnd"/>
@@ -5751,6 +5762,10 @@
       <w:r>
         <w:rPr>
           <w:rFonts w:asciiTheme="majorBidi" w:hAnsiTheme="majorBidi" w:cstheme="majorBidi"/>
+          <w:b/>
+          <w:bCs/>
+          <w:i/>
+          <w:iCs/>
           <w:sz w:val="28"/>
           <w:szCs w:val="28"/>
         </w:rPr>
@@ -5763,25 +5778,7 @@
           <w:sz w:val="28"/>
           <w:szCs w:val="28"/>
         </w:rPr>
-        <w:t xml:space="preserve"> in a </w:t>
-      </w:r>
-      <w:proofErr w:type="spellStart"/>
-      <w:r>
-        <w:rPr>
-          <w:rFonts w:asciiTheme="majorBidi" w:hAnsiTheme="majorBidi" w:cstheme="majorBidi"/>
-          <w:sz w:val="28"/>
-          <w:szCs w:val="28"/>
-        </w:rPr>
-        <w:t>DaemonSet</w:t>
-      </w:r>
-      <w:proofErr w:type="spellEnd"/>
-      <w:r>
-        <w:rPr>
-          <w:rFonts w:asciiTheme="majorBidi" w:hAnsiTheme="majorBidi" w:cstheme="majorBidi"/>
-          <w:sz w:val="28"/>
-          <w:szCs w:val="28"/>
-        </w:rPr>
-        <w:t xml:space="preserve"> allows Kubernetes to create the new Pod on a node before deleting the old one, temporarily running two Pods on the same node during updates to prevent service gaps.</w:t>
+        <w:t xml:space="preserve"> in a DaemonSet allows Kubernetes to create the new Pod on a node before deleting the old one, temporarily running two Pods on the same node during updates to prevent service gaps.</w:t>
       </w:r>
     </w:p>
     <w:p>
@@ -5942,16 +5939,16 @@
         <mc:AlternateContent>
           <mc:Choice Requires="wps">
             <w:drawing>
-              <wp:anchor distT="0" distB="0" distL="114300" distR="114300" simplePos="0" relativeHeight="251665408" behindDoc="0" locked="0" layoutInCell="1" allowOverlap="1" wp14:anchorId="3555EA3D" wp14:editId="4E914D85">
+              <wp:anchor distT="0" distB="0" distL="114300" distR="114300" simplePos="0" relativeHeight="251665408" behindDoc="0" locked="0" layoutInCell="1" allowOverlap="1" wp14:anchorId="3555EA3D" wp14:editId="0DBF28D0">
                 <wp:simplePos x="0" y="0"/>
                 <wp:positionH relativeFrom="column">
                   <wp:posOffset>228600</wp:posOffset>
                 </wp:positionH>
                 <wp:positionV relativeFrom="paragraph">
-                  <wp:posOffset>314960</wp:posOffset>
+                  <wp:posOffset>278765</wp:posOffset>
                 </wp:positionV>
-                <wp:extent cx="1539240" cy="640080"/>
-                <wp:effectExtent l="0" t="0" r="22860" b="26670"/>
+                <wp:extent cx="1539240" cy="548640"/>
+                <wp:effectExtent l="0" t="0" r="22860" b="22860"/>
                 <wp:wrapNone/>
                 <wp:docPr id="1060923402" name="Rectangle 6"/>
                 <wp:cNvGraphicFramePr/>
@@ -5962,7 +5959,7 @@
                       <wps:spPr>
                         <a:xfrm>
                           <a:off x="0" y="0"/>
-                          <a:ext cx="1539240" cy="640080"/>
+                          <a:ext cx="1539240" cy="548640"/>
                         </a:xfrm>
                         <a:prstGeom prst="rect">
                           <a:avLst/>
@@ -6086,12 +6083,15 @@
                 <wp14:sizeRelH relativeFrom="margin">
                   <wp14:pctWidth>0</wp14:pctWidth>
                 </wp14:sizeRelH>
+                <wp14:sizeRelV relativeFrom="margin">
+                  <wp14:pctHeight>0</wp14:pctHeight>
+                </wp14:sizeRelV>
               </wp:anchor>
             </w:drawing>
           </mc:Choice>
           <mc:Fallback>
             <w:pict>
-              <v:rect w14:anchorId="3555EA3D" id="Rectangle 6" o:spid="_x0000_s1031" style="position:absolute;left:0;text-align:left;margin-left:18pt;margin-top:24.8pt;width:121.2pt;height:50.4pt;z-index:251665408;visibility:visible;mso-wrap-style:square;mso-width-percent:0;mso-wrap-distance-left:9pt;mso-wrap-distance-top:0;mso-wrap-distance-right:9pt;mso-wrap-distance-bottom:0;mso-position-horizontal:absolute;mso-position-horizontal-relative:text;mso-position-vertical:absolute;mso-position-vertical-relative:text;mso-width-percent:0;mso-width-relative:margin;v-text-anchor:middle" o:gfxdata="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" fillcolor="black [3200]" strokecolor="black [480]" strokeweight="1pt">
+              <v:rect w14:anchorId="3555EA3D" id="Rectangle 6" o:spid="_x0000_s1031" style="position:absolute;left:0;text-align:left;margin-left:18pt;margin-top:21.95pt;width:121.2pt;height:43.2pt;z-index:251665408;visibility:visible;mso-wrap-style:square;mso-width-percent:0;mso-height-percent:0;mso-wrap-distance-left:9pt;mso-wrap-distance-top:0;mso-wrap-distance-right:9pt;mso-wrap-distance-bottom:0;mso-position-horizontal:absolute;mso-position-horizontal-relative:text;mso-position-vertical:absolute;mso-position-vertical-relative:text;mso-width-percent:0;mso-height-percent:0;mso-width-relative:margin;mso-height-relative:margin;v-text-anchor:middle" o:gfxdata="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" fillcolor="black [3200]" strokecolor="black [480]" strokeweight="1pt">
                 <v:textbox>
                   <w:txbxContent>
                     <w:p>
@@ -6214,13 +6214,14 @@
         <w:jc w:val="both"/>
         <w:rPr>
           <w:rFonts w:asciiTheme="majorBidi" w:hAnsiTheme="majorBidi" w:cstheme="majorBidi"/>
-          <w:sz w:val="36"/>
-          <w:szCs w:val="36"/>
-        </w:rPr>
-      </w:pPr>
-    </w:p>
-    <w:p>
-      <w:pPr>
+          <w:sz w:val="22"/>
+          <w:szCs w:val="22"/>
+        </w:rPr>
+      </w:pPr>
+    </w:p>
+    <w:p>
+      <w:pPr>
+        <w:spacing w:after="60"/>
         <w:ind w:left="360"/>
         <w:jc w:val="both"/>
         <w:rPr>
@@ -6321,6 +6322,7 @@
           <w:ilvl w:val="0"/>
           <w:numId w:val="21"/>
         </w:numPr>
+        <w:spacing w:after="60"/>
         <w:ind w:left="720"/>
         <w:jc w:val="both"/>
         <w:rPr>
@@ -6340,19 +6342,22 @@
     </w:p>
     <w:p>
       <w:pPr>
+        <w:spacing w:after="60"/>
         <w:ind w:left="360"/>
         <w:jc w:val="both"/>
         <w:rPr>
           <w:rFonts w:asciiTheme="majorBidi" w:hAnsiTheme="majorBidi" w:cstheme="majorBidi"/>
           <w:sz w:val="28"/>
           <w:szCs w:val="28"/>
-        </w:rPr>
-      </w:pPr>
-      <w:r>
-        <w:rPr>
-          <w:rFonts w:asciiTheme="majorBidi" w:hAnsiTheme="majorBidi" w:cstheme="majorBidi"/>
-          <w:sz w:val="28"/>
-          <w:szCs w:val="28"/>
+          <w:u w:val="single"/>
+        </w:rPr>
+      </w:pPr>
+      <w:r>
+        <w:rPr>
+          <w:rFonts w:asciiTheme="majorBidi" w:hAnsiTheme="majorBidi" w:cstheme="majorBidi"/>
+          <w:sz w:val="28"/>
+          <w:szCs w:val="28"/>
+          <w:u w:val="single"/>
         </w:rPr>
         <w:t>Example command:</w:t>
       </w:r>
@@ -6382,7 +6387,6 @@
           <w:sz w:val="28"/>
           <w:szCs w:val="28"/>
         </w:rPr>
-        <w:lastRenderedPageBreak/>
         <w:t>kubectl</w:t>
       </w:r>
       <w:proofErr w:type="spellEnd"/>
@@ -6447,6 +6451,7 @@
           <w:sz w:val="32"/>
           <w:szCs w:val="32"/>
         </w:rPr>
+        <w:lastRenderedPageBreak/>
         <w:t>RollingUpdate</w:t>
       </w:r>
       <w:proofErr w:type="spellEnd"/>
@@ -7126,17 +7131,17 @@
           <w:rFonts w:asciiTheme="majorBidi" w:hAnsiTheme="majorBidi" w:cstheme="majorBidi"/>
           <w:b/>
           <w:bCs/>
-          <w:sz w:val="28"/>
-          <w:szCs w:val="28"/>
-        </w:rPr>
-      </w:pPr>
-      <w:r>
-        <w:rPr>
-          <w:rFonts w:asciiTheme="majorBidi" w:hAnsiTheme="majorBidi" w:cstheme="majorBidi"/>
-          <w:b/>
-          <w:bCs/>
-          <w:sz w:val="28"/>
-          <w:szCs w:val="28"/>
+          <w:sz w:val="32"/>
+          <w:szCs w:val="32"/>
+        </w:rPr>
+      </w:pPr>
+      <w:r>
+        <w:rPr>
+          <w:rFonts w:asciiTheme="majorBidi" w:hAnsiTheme="majorBidi" w:cstheme="majorBidi"/>
+          <w:b/>
+          <w:bCs/>
+          <w:sz w:val="32"/>
+          <w:szCs w:val="32"/>
         </w:rPr>
         <w:t>Summary:</w:t>
       </w:r>
@@ -7293,6 +7298,19 @@
           <w:rFonts w:asciiTheme="majorBidi" w:hAnsiTheme="majorBidi" w:cstheme="majorBidi"/>
           <w:sz w:val="28"/>
           <w:szCs w:val="28"/>
+        </w:rPr>
+      </w:pPr>
+    </w:p>
+    <w:p>
+      <w:pPr>
+        <w:spacing w:after="60"/>
+        <w:jc w:val="both"/>
+        <w:rPr>
+          <w:rFonts w:asciiTheme="majorBidi" w:hAnsiTheme="majorBidi" w:cstheme="majorBidi"/>
+          <w:b/>
+          <w:bCs/>
+          <w:sz w:val="36"/>
+          <w:szCs w:val="36"/>
         </w:rPr>
       </w:pPr>
     </w:p>
@@ -8680,6 +8698,7 @@
     </w:p>
     <w:p>
       <w:pPr>
+        <w:spacing w:after="60"/>
         <w:jc w:val="both"/>
         <w:rPr>
           <w:rFonts w:asciiTheme="majorBidi" w:hAnsiTheme="majorBidi" w:cstheme="majorBidi"/>
@@ -8767,6 +8786,7 @@
     </w:p>
     <w:p>
       <w:pPr>
+        <w:spacing w:after="60"/>
         <w:ind w:left="360"/>
         <w:jc w:val="both"/>
         <w:rPr>
@@ -8861,6 +8881,7 @@
     </w:p>
     <w:p>
       <w:pPr>
+        <w:spacing w:after="60"/>
         <w:ind w:left="360"/>
         <w:jc w:val="both"/>
         <w:rPr>
@@ -8945,6 +8966,7 @@
     </w:p>
     <w:p>
       <w:pPr>
+        <w:spacing w:after="120"/>
         <w:ind w:left="360"/>
         <w:jc w:val="both"/>
         <w:rPr>
@@ -8964,22 +8986,23 @@
     </w:p>
     <w:p>
       <w:pPr>
+        <w:spacing w:after="60"/>
         <w:jc w:val="both"/>
         <w:rPr>
           <w:rFonts w:asciiTheme="majorBidi" w:hAnsiTheme="majorBidi" w:cstheme="majorBidi"/>
           <w:b/>
           <w:bCs/>
-          <w:sz w:val="28"/>
-          <w:szCs w:val="28"/>
-        </w:rPr>
-      </w:pPr>
-      <w:r>
-        <w:rPr>
-          <w:rFonts w:asciiTheme="majorBidi" w:hAnsiTheme="majorBidi" w:cstheme="majorBidi"/>
-          <w:b/>
-          <w:bCs/>
-          <w:sz w:val="28"/>
-          <w:szCs w:val="28"/>
+          <w:sz w:val="32"/>
+          <w:szCs w:val="32"/>
+        </w:rPr>
+      </w:pPr>
+      <w:r>
+        <w:rPr>
+          <w:rFonts w:asciiTheme="majorBidi" w:hAnsiTheme="majorBidi" w:cstheme="majorBidi"/>
+          <w:b/>
+          <w:bCs/>
+          <w:sz w:val="32"/>
+          <w:szCs w:val="32"/>
         </w:rPr>
         <w:t>Conclusion</w:t>
       </w:r>
@@ -9061,7 +9084,11 @@
           <w:szCs w:val="36"/>
         </w:rPr>
       </w:pPr>
-      <w:r>
+    </w:p>
+    <w:p>
+      <w:pPr>
+        <w:spacing w:after="60"/>
+        <w:jc w:val="both"/>
         <w:rPr>
           <w:rFonts w:asciiTheme="majorBidi" w:hAnsiTheme="majorBidi" w:cstheme="majorBidi"/>
           <w:b/>
@@ -9069,6 +9096,15 @@
           <w:sz w:val="36"/>
           <w:szCs w:val="36"/>
         </w:rPr>
+      </w:pPr>
+      <w:r>
+        <w:rPr>
+          <w:rFonts w:asciiTheme="majorBidi" w:hAnsiTheme="majorBidi" w:cstheme="majorBidi"/>
+          <w:b/>
+          <w:bCs/>
+          <w:sz w:val="36"/>
+          <w:szCs w:val="36"/>
+        </w:rPr>
         <w:lastRenderedPageBreak/>
         <w:t>Rollback</w:t>
       </w:r>
@@ -9122,6 +9158,7 @@
     </w:p>
     <w:p>
       <w:pPr>
+        <w:spacing w:after="60"/>
         <w:rPr>
           <w:rFonts w:asciiTheme="majorBidi" w:hAnsiTheme="majorBidi" w:cstheme="majorBidi"/>
           <w:b/>
@@ -9143,6 +9180,7 @@
     </w:p>
     <w:p>
       <w:pPr>
+        <w:spacing w:after="60"/>
         <w:rPr>
           <w:rFonts w:asciiTheme="majorBidi" w:hAnsiTheme="majorBidi" w:cstheme="majorBidi"/>
           <w:sz w:val="28"/>
@@ -9283,7 +9321,7 @@
           <w:ilvl w:val="0"/>
           <w:numId w:val="25"/>
         </w:numPr>
-        <w:spacing w:after="120"/>
+        <w:spacing w:after="60"/>
         <w:ind w:left="360"/>
         <w:rPr>
           <w:rFonts w:asciiTheme="majorBidi" w:hAnsiTheme="majorBidi" w:cstheme="majorBidi"/>
@@ -9350,7 +9388,7 @@
     </w:p>
     <w:p>
       <w:pPr>
-        <w:spacing w:after="120"/>
+        <w:spacing w:after="60"/>
         <w:jc w:val="both"/>
         <w:rPr>
           <w:rFonts w:asciiTheme="majorBidi" w:hAnsiTheme="majorBidi" w:cstheme="majorBidi"/>
@@ -9384,16 +9422,14 @@
         </w:rPr>
         <w:t xml:space="preserve"> history, so rollback is easy.</w:t>
       </w:r>
-    </w:p>
-    <w:p>
-      <w:pPr>
-        <w:spacing w:after="60"/>
-        <w:rPr>
-          <w:rFonts w:asciiTheme="majorBidi" w:hAnsiTheme="majorBidi" w:cstheme="majorBidi"/>
-          <w:sz w:val="28"/>
-          <w:szCs w:val="28"/>
-        </w:rPr>
-      </w:pPr>
+      <w:r>
+        <w:rPr>
+          <w:rFonts w:asciiTheme="majorBidi" w:hAnsiTheme="majorBidi" w:cstheme="majorBidi"/>
+          <w:sz w:val="28"/>
+          <w:szCs w:val="28"/>
+        </w:rPr>
+        <w:t xml:space="preserve"> </w:t>
+      </w:r>
       <w:proofErr w:type="spellStart"/>
       <w:r>
         <w:rPr>
@@ -9461,6 +9497,7 @@
           <w:ilvl w:val="0"/>
           <w:numId w:val="26"/>
         </w:numPr>
+        <w:spacing w:after="120"/>
         <w:ind w:left="360"/>
         <w:rPr>
           <w:rFonts w:asciiTheme="majorBidi" w:hAnsiTheme="majorBidi" w:cstheme="majorBidi"/>
@@ -9479,6 +9516,7 @@
     </w:p>
     <w:p>
       <w:pPr>
+        <w:spacing w:after="60"/>
         <w:rPr>
           <w:rFonts w:asciiTheme="majorBidi" w:hAnsiTheme="majorBidi" w:cstheme="majorBidi"/>
           <w:sz w:val="28"/>
@@ -9615,7 +9653,27 @@
           <w:sz w:val="28"/>
           <w:szCs w:val="28"/>
         </w:rPr>
-        <w:t>In practice, rollback is done by manually updating the DaemonSet spec.</w:t>
+        <w:t xml:space="preserve">In practice, rollback is done by manually updating the DaemonSet </w:t>
+      </w:r>
+      <w:r>
+        <w:rPr>
+          <w:rFonts w:asciiTheme="majorBidi" w:hAnsiTheme="majorBidi" w:cstheme="majorBidi"/>
+          <w:b/>
+          <w:bCs/>
+          <w:i/>
+          <w:iCs/>
+          <w:sz w:val="28"/>
+          <w:szCs w:val="28"/>
+        </w:rPr>
+        <w:t>spec</w:t>
+      </w:r>
+      <w:r>
+        <w:rPr>
+          <w:rFonts w:asciiTheme="majorBidi" w:hAnsiTheme="majorBidi" w:cstheme="majorBidi"/>
+          <w:sz w:val="28"/>
+          <w:szCs w:val="28"/>
+        </w:rPr>
+        <w:t>.</w:t>
       </w:r>
     </w:p>
     <w:p>
@@ -9874,7 +9932,7 @@
 </file>
 
 <file path=word/numbering.xml><?xml version="1.0" encoding="utf-8"?>
-<w:numbering xmlns:wpc="http://schemas.microsoft.com/office/word/2010/wordprocessingCanvas" xmlns:cx="http://schemas.microsoft.com/office/drawing/2014/chartex" xmlns:cx1="http://schemas.microsoft.com/office/drawing/2015/9/8/chartex" xmlns:cx2="http://schemas.microsoft.com/office/drawing/2015/10/21/chartex" xmlns:cx3="http://schemas.microsoft.com/office/drawing/2016/5/9/chartex" xmlns:cx4="http://schemas.microsoft.com/office/drawing/2016/5/10/chartex" xmlns:cx5="http://schemas.microsoft.com/office/drawing/2016/5/11/chartex" xmlns:cx6="http://schemas.microsoft.com/office/drawing/2016/5/12/chartex" xmlns:cx7="http://schemas.microsoft.com/office/drawing/2016/5/13/chartex" xmlns:cx8="http://schemas.microsoft.com/office/drawing/2016/5/14/chartex" xmlns:mc="http://schemas.openxmlformats.org/markup-compatibility/2006" xmlns:aink="http://schemas.microsoft.com/office/drawing/2016/ink" xmlns:am3d="http://schemas.microsoft.com/office/drawing/2017/model3d" xmlns:o="urn:schemas-microsoft-com:office:office" xmlns:oel="http://schemas.microsoft.com/office/2019/extlst" xmlns:r="http://schemas.openxmlformats.org/officeDocument/2006/relationships" xmlns:m="http://schemas.openxmlformats.org/officeDocument/2006/math" xmlns:v="urn:schemas-microsoft-com:vml" xmlns:wp14="http://schemas.microsoft.com/office/word/2010/wordprocessingDrawing" xmlns:wp="http://schemas.openxmlformats.org/drawingml/2006/wordprocessingDrawing" xmlns:w10="urn:schemas-microsoft-com:office:word" xmlns:w="http://schemas.openxmlformats.org/wordprocessingml/2006/main" xmlns:w14="http://schemas.microsoft.com/office/word/2010/wordml" xmlns:w15="http://schemas.microsoft.com/office/word/2012/wordml" xmlns:w16cex="http://schemas.microsoft.com/office/word/2018/wordml/cex" xmlns:w16cid="http://schemas.microsoft.com/office/word/2016/wordml/cid" xmlns:w16="http://schemas.microsoft.com/office/word/2018/wordml" xmlns:w16sdtdh="http://schemas.microsoft.com/office/word/2020/wordml/sdtdatahash" xmlns:w16se="http://schemas.microsoft.com/office/word/2015/wordml/symex" xmlns:wpg="http://schemas.microsoft.com/office/word/2010/wordprocessingGroup" xmlns:wpi="http://schemas.microsoft.com/office/word/2010/wordprocessingInk" xmlns:wne="http://schemas.microsoft.com/office/word/2006/wordml" xmlns:wps="http://schemas.microsoft.com/office/word/2010/wordprocessingShape" mc:Ignorable="w14 w15 w16se w16cid w16 w16cex w16sdtdh wp14">
+<w:numbering xmlns:wpc="http://schemas.microsoft.com/office/word/2010/wordprocessingCanvas" xmlns:cx="http://schemas.microsoft.com/office/drawing/2014/chartex" xmlns:cx1="http://schemas.microsoft.com/office/drawing/2015/9/8/chartex" xmlns:cx2="http://schemas.microsoft.com/office/drawing/2015/10/21/chartex" xmlns:cx3="http://schemas.microsoft.com/office/drawing/2016/5/9/chartex" xmlns:cx4="http://schemas.microsoft.com/office/drawing/2016/5/10/chartex" xmlns:cx5="http://schemas.microsoft.com/office/drawing/2016/5/11/chartex" xmlns:cx6="http://schemas.microsoft.com/office/drawing/2016/5/12/chartex" xmlns:cx7="http://schemas.microsoft.com/office/drawing/2016/5/13/chartex" xmlns:cx8="http://schemas.microsoft.com/office/drawing/2016/5/14/chartex" xmlns:mc="http://schemas.openxmlformats.org/markup-compatibility/2006" xmlns:aink="http://schemas.microsoft.com/office/drawing/2016/ink" xmlns:am3d="http://schemas.microsoft.com/office/drawing/2017/model3d" xmlns:o="urn:schemas-microsoft-com:office:office" xmlns:oel="http://schemas.microsoft.com/office/2019/extlst" xmlns:r="http://schemas.openxmlformats.org/officeDocument/2006/relationships" xmlns:m="http://schemas.openxmlformats.org/officeDocument/2006/math" xmlns:v="urn:schemas-microsoft-com:vml" xmlns:wp14="http://schemas.microsoft.com/office/word/2010/wordprocessingDrawing" xmlns:wp="http://schemas.openxmlformats.org/drawingml/2006/wordprocessingDrawing" xmlns:w10="urn:schemas-microsoft-com:office:word" xmlns:w="http://schemas.openxmlformats.org/wordprocessingml/2006/main" xmlns:w14="http://schemas.microsoft.com/office/word/2010/wordml" xmlns:w15="http://schemas.microsoft.com/office/word/2012/wordml" xmlns:w16cex="http://schemas.microsoft.com/office/word/2018/wordml/cex" xmlns:w16cid="http://schemas.microsoft.com/office/word/2016/wordml/cid" xmlns:w16="http://schemas.microsoft.com/office/word/2018/wordml" xmlns:w16du="http://schemas.microsoft.com/office/word/2023/wordml/word16du" xmlns:w16sdtdh="http://schemas.microsoft.com/office/word/2020/wordml/sdtdatahash" xmlns:w16sdtfl="http://schemas.microsoft.com/office/word/2024/wordml/sdtformatlock" xmlns:w16se="http://schemas.microsoft.com/office/word/2015/wordml/symex" xmlns:wpg="http://schemas.microsoft.com/office/word/2010/wordprocessingGroup" xmlns:wpi="http://schemas.microsoft.com/office/word/2010/wordprocessingInk" xmlns:wne="http://schemas.microsoft.com/office/word/2006/wordml" xmlns:wps="http://schemas.microsoft.com/office/word/2010/wordprocessingShape" mc:Ignorable="w14 w15 w16se w16cid w16 w16cex w16sdtdh w16sdtfl w16du wp14">
   <w:abstractNum w:abstractNumId="0" w15:restartNumberingAfterBreak="0">
     <w:nsid w:val="06301D46"/>
     <w:multiLevelType w:val="hybridMultilevel"/>
@@ -12783,7 +12841,7 @@
 </file>
 
 <file path=word/styles.xml><?xml version="1.0" encoding="utf-8"?>
-<w:styles xmlns:mc="http://schemas.openxmlformats.org/markup-compatibility/2006" xmlns:r="http://schemas.openxmlformats.org/officeDocument/2006/relationships" xmlns:w="http://schemas.openxmlformats.org/wordprocessingml/2006/main" xmlns:w14="http://schemas.microsoft.com/office/word/2010/wordml" xmlns:w15="http://schemas.microsoft.com/office/word/2012/wordml" xmlns:w16cex="http://schemas.microsoft.com/office/word/2018/wordml/cex" xmlns:w16cid="http://schemas.microsoft.com/office/word/2016/wordml/cid" xmlns:w16="http://schemas.microsoft.com/office/word/2018/wordml" xmlns:w16sdtdh="http://schemas.microsoft.com/office/word/2020/wordml/sdtdatahash" xmlns:w16se="http://schemas.microsoft.com/office/word/2015/wordml/symex" mc:Ignorable="w14 w15 w16se w16cid w16 w16cex w16sdtdh">
+<w:styles xmlns:mc="http://schemas.openxmlformats.org/markup-compatibility/2006" xmlns:r="http://schemas.openxmlformats.org/officeDocument/2006/relationships" xmlns:w="http://schemas.openxmlformats.org/wordprocessingml/2006/main" xmlns:w14="http://schemas.microsoft.com/office/word/2010/wordml" xmlns:w15="http://schemas.microsoft.com/office/word/2012/wordml" xmlns:w16cex="http://schemas.microsoft.com/office/word/2018/wordml/cex" xmlns:w16cid="http://schemas.microsoft.com/office/word/2016/wordml/cid" xmlns:w16="http://schemas.microsoft.com/office/word/2018/wordml" xmlns:w16du="http://schemas.microsoft.com/office/word/2023/wordml/word16du" xmlns:w16sdtdh="http://schemas.microsoft.com/office/word/2020/wordml/sdtdatahash" xmlns:w16sdtfl="http://schemas.microsoft.com/office/word/2024/wordml/sdtformatlock" xmlns:w16se="http://schemas.microsoft.com/office/word/2015/wordml/symex" mc:Ignorable="w14 w15 w16se w16cid w16 w16cex w16sdtdh w16sdtfl w16du">
   <w:docDefaults>
     <w:rPrDefault>
       <w:rPr>

</xml_diff>

<commit_message>
kubernetes - daemonset updated
</commit_message>
<xml_diff>
--- a/Kubernetes/8-daemonset-a4.docx
+++ b/Kubernetes/8-daemonset-a4.docx
@@ -1,6 +1,6 @@
 
 <file path=word/document.xml><?xml version="1.0" encoding="utf-8"?>
-<w:document xmlns:wpc="http://schemas.microsoft.com/office/word/2010/wordprocessingCanvas" xmlns:cx="http://schemas.microsoft.com/office/drawing/2014/chartex" xmlns:cx1="http://schemas.microsoft.com/office/drawing/2015/9/8/chartex" xmlns:cx2="http://schemas.microsoft.com/office/drawing/2015/10/21/chartex" xmlns:cx3="http://schemas.microsoft.com/office/drawing/2016/5/9/chartex" xmlns:cx4="http://schemas.microsoft.com/office/drawing/2016/5/10/chartex" xmlns:cx5="http://schemas.microsoft.com/office/drawing/2016/5/11/chartex" xmlns:cx6="http://schemas.microsoft.com/office/drawing/2016/5/12/chartex" xmlns:cx7="http://schemas.microsoft.com/office/drawing/2016/5/13/chartex" xmlns:cx8="http://schemas.microsoft.com/office/drawing/2016/5/14/chartex" xmlns:mc="http://schemas.openxmlformats.org/markup-compatibility/2006" xmlns:aink="http://schemas.microsoft.com/office/drawing/2016/ink" xmlns:am3d="http://schemas.microsoft.com/office/drawing/2017/model3d" xmlns:o="urn:schemas-microsoft-com:office:office" xmlns:oel="http://schemas.microsoft.com/office/2019/extlst" xmlns:r="http://schemas.openxmlformats.org/officeDocument/2006/relationships" xmlns:m="http://schemas.openxmlformats.org/officeDocument/2006/math" xmlns:v="urn:schemas-microsoft-com:vml" xmlns:wp14="http://schemas.microsoft.com/office/word/2010/wordprocessingDrawing" xmlns:wp="http://schemas.openxmlformats.org/drawingml/2006/wordprocessingDrawing" xmlns:w10="urn:schemas-microsoft-com:office:word" xmlns:w="http://schemas.openxmlformats.org/wordprocessingml/2006/main" xmlns:w14="http://schemas.microsoft.com/office/word/2010/wordml" xmlns:w15="http://schemas.microsoft.com/office/word/2012/wordml" xmlns:w16cex="http://schemas.microsoft.com/office/word/2018/wordml/cex" xmlns:w16cid="http://schemas.microsoft.com/office/word/2016/wordml/cid" xmlns:w16="http://schemas.microsoft.com/office/word/2018/wordml" xmlns:w16du="http://schemas.microsoft.com/office/word/2023/wordml/word16du" xmlns:w16sdtdh="http://schemas.microsoft.com/office/word/2020/wordml/sdtdatahash" xmlns:w16sdtfl="http://schemas.microsoft.com/office/word/2024/wordml/sdtformatlock" xmlns:w16se="http://schemas.microsoft.com/office/word/2015/wordml/symex" xmlns:wpg="http://schemas.microsoft.com/office/word/2010/wordprocessingGroup" xmlns:wpi="http://schemas.microsoft.com/office/word/2010/wordprocessingInk" xmlns:wne="http://schemas.microsoft.com/office/word/2006/wordml" xmlns:wps="http://schemas.microsoft.com/office/word/2010/wordprocessingShape" mc:Ignorable="w14 w15 w16se w16cid w16 w16cex w16sdtdh w16sdtfl w16du wp14">
+<w:document xmlns:wpc="http://schemas.microsoft.com/office/word/2010/wordprocessingCanvas" xmlns:cx="http://schemas.microsoft.com/office/drawing/2014/chartex" xmlns:cx1="http://schemas.microsoft.com/office/drawing/2015/9/8/chartex" xmlns:cx2="http://schemas.microsoft.com/office/drawing/2015/10/21/chartex" xmlns:cx3="http://schemas.microsoft.com/office/drawing/2016/5/9/chartex" xmlns:cx4="http://schemas.microsoft.com/office/drawing/2016/5/10/chartex" xmlns:cx5="http://schemas.microsoft.com/office/drawing/2016/5/11/chartex" xmlns:cx6="http://schemas.microsoft.com/office/drawing/2016/5/12/chartex" xmlns:cx7="http://schemas.microsoft.com/office/drawing/2016/5/13/chartex" xmlns:cx8="http://schemas.microsoft.com/office/drawing/2016/5/14/chartex" xmlns:mc="http://schemas.openxmlformats.org/markup-compatibility/2006" xmlns:aink="http://schemas.microsoft.com/office/drawing/2016/ink" xmlns:am3d="http://schemas.microsoft.com/office/drawing/2017/model3d" xmlns:o="urn:schemas-microsoft-com:office:office" xmlns:oel="http://schemas.microsoft.com/office/2019/extlst" xmlns:r="http://schemas.openxmlformats.org/officeDocument/2006/relationships" xmlns:m="http://schemas.openxmlformats.org/officeDocument/2006/math" xmlns:v="urn:schemas-microsoft-com:vml" xmlns:wp14="http://schemas.microsoft.com/office/word/2010/wordprocessingDrawing" xmlns:wp="http://schemas.openxmlformats.org/drawingml/2006/wordprocessingDrawing" xmlns:w10="urn:schemas-microsoft-com:office:word" xmlns:w="http://schemas.openxmlformats.org/wordprocessingml/2006/main" xmlns:w14="http://schemas.microsoft.com/office/word/2010/wordml" xmlns:w15="http://schemas.microsoft.com/office/word/2012/wordml" xmlns:w16cei="http://schemas.microsoft.com/office/word/2026/wordml/cei" xmlns:w16cex="http://schemas.microsoft.com/office/word/2018/wordml/cex" xmlns:w16cid="http://schemas.microsoft.com/office/word/2016/wordml/cid" xmlns:w16="http://schemas.microsoft.com/office/word/2018/wordml" xmlns:w16du="http://schemas.microsoft.com/office/word/2023/wordml/word16du" xmlns:w16sdtdh="http://schemas.microsoft.com/office/word/2020/wordml/sdtdatahash" xmlns:w16sdtfl="http://schemas.microsoft.com/office/word/2024/wordml/sdtformatlock" xmlns:w16se="http://schemas.microsoft.com/office/word/2015/wordml/symex" xmlns:wpg="http://schemas.microsoft.com/office/word/2010/wordprocessingGroup" xmlns:wpi="http://schemas.microsoft.com/office/word/2010/wordprocessingInk" xmlns:wne="http://schemas.microsoft.com/office/word/2006/wordml" xmlns:wps="http://schemas.microsoft.com/office/word/2010/wordprocessingShape" mc:Ignorable="w14 w15 w16se w16cid w16 w16cex w16sdtdh w16sdtfl w16du wp14">
   <w:body>
     <w:p>
       <w:pPr>
@@ -97,6 +97,7 @@
     <w:p>
       <w:pPr>
         <w:spacing w:after="60"/>
+        <w:jc w:val="both"/>
         <w:rPr>
           <w:rFonts w:asciiTheme="majorBidi" w:hAnsiTheme="majorBidi" w:cstheme="majorBidi"/>
           <w:b/>
@@ -141,6 +142,7 @@
     <w:p>
       <w:pPr>
         <w:spacing w:after="80"/>
+        <w:jc w:val="both"/>
         <w:rPr>
           <w:rFonts w:asciiTheme="majorBidi" w:hAnsiTheme="majorBidi" w:cstheme="majorBidi"/>
           <w:sz w:val="28"/>
@@ -159,6 +161,7 @@
     <w:p>
       <w:pPr>
         <w:spacing w:after="60"/>
+        <w:jc w:val="both"/>
         <w:rPr>
           <w:rFonts w:asciiTheme="majorBidi" w:hAnsiTheme="majorBidi" w:cstheme="majorBidi"/>
           <w:sz w:val="28"/>
@@ -184,6 +187,7 @@
           <w:numId w:val="4"/>
         </w:numPr>
         <w:ind w:left="360"/>
+        <w:jc w:val="both"/>
         <w:rPr>
           <w:rFonts w:asciiTheme="majorBidi" w:hAnsiTheme="majorBidi" w:cstheme="majorBidi"/>
           <w:sz w:val="28"/>
@@ -235,6 +239,7 @@
           <w:numId w:val="4"/>
         </w:numPr>
         <w:ind w:left="360"/>
+        <w:jc w:val="both"/>
         <w:rPr>
           <w:rFonts w:asciiTheme="majorBidi" w:hAnsiTheme="majorBidi" w:cstheme="majorBidi"/>
           <w:sz w:val="28"/>
@@ -258,6 +263,7 @@
           <w:numId w:val="4"/>
         </w:numPr>
         <w:ind w:left="360"/>
+        <w:jc w:val="both"/>
         <w:rPr>
           <w:rFonts w:asciiTheme="majorBidi" w:hAnsiTheme="majorBidi" w:cstheme="majorBidi"/>
           <w:sz w:val="28"/>
@@ -281,6 +287,7 @@
           <w:numId w:val="4"/>
         </w:numPr>
         <w:ind w:left="360"/>
+        <w:jc w:val="both"/>
         <w:rPr>
           <w:rFonts w:asciiTheme="majorBidi" w:hAnsiTheme="majorBidi" w:cstheme="majorBidi"/>
           <w:sz w:val="28"/>
@@ -305,6 +312,7 @@
         </w:numPr>
         <w:spacing w:after="120"/>
         <w:ind w:left="360"/>
+        <w:jc w:val="both"/>
         <w:rPr>
           <w:rFonts w:asciiTheme="majorBidi" w:hAnsiTheme="majorBidi" w:cstheme="majorBidi"/>
           <w:sz w:val="28"/>
@@ -323,6 +331,7 @@
     <w:p>
       <w:pPr>
         <w:spacing w:after="80"/>
+        <w:jc w:val="both"/>
         <w:rPr>
           <w:rFonts w:asciiTheme="majorBidi" w:hAnsiTheme="majorBidi" w:cstheme="majorBidi"/>
           <w:sz w:val="28"/>
@@ -341,6 +350,7 @@
     <w:p>
       <w:pPr>
         <w:spacing w:after="60"/>
+        <w:jc w:val="both"/>
         <w:rPr>
           <w:rFonts w:asciiTheme="majorBidi" w:hAnsiTheme="majorBidi" w:cstheme="majorBidi"/>
           <w:b/>
@@ -363,6 +373,7 @@
     <w:p>
       <w:pPr>
         <w:spacing w:after="40"/>
+        <w:jc w:val="both"/>
         <w:rPr>
           <w:rFonts w:asciiTheme="majorBidi" w:hAnsiTheme="majorBidi" w:cstheme="majorBidi"/>
           <w:sz w:val="28"/>
@@ -387,6 +398,7 @@
         </w:numPr>
         <w:spacing w:after="60"/>
         <w:ind w:left="360"/>
+        <w:jc w:val="both"/>
         <w:rPr>
           <w:rFonts w:asciiTheme="majorBidi" w:hAnsiTheme="majorBidi" w:cstheme="majorBidi"/>
           <w:sz w:val="28"/>
@@ -411,6 +423,7 @@
         </w:numPr>
         <w:spacing w:after="60"/>
         <w:ind w:left="360"/>
+        <w:jc w:val="both"/>
         <w:rPr>
           <w:rFonts w:asciiTheme="majorBidi" w:hAnsiTheme="majorBidi" w:cstheme="majorBidi"/>
           <w:sz w:val="28"/>
@@ -435,6 +448,7 @@
         </w:numPr>
         <w:spacing w:after="60"/>
         <w:ind w:left="360"/>
+        <w:jc w:val="both"/>
         <w:rPr>
           <w:rFonts w:asciiTheme="majorBidi" w:hAnsiTheme="majorBidi" w:cstheme="majorBidi"/>
           <w:sz w:val="28"/>
@@ -459,6 +473,7 @@
         </w:numPr>
         <w:spacing w:after="60"/>
         <w:ind w:left="360"/>
+        <w:jc w:val="both"/>
         <w:rPr>
           <w:rFonts w:asciiTheme="majorBidi" w:hAnsiTheme="majorBidi" w:cstheme="majorBidi"/>
           <w:sz w:val="28"/>
@@ -477,6 +492,7 @@
     <w:p>
       <w:pPr>
         <w:spacing w:after="60"/>
+        <w:jc w:val="both"/>
         <w:rPr>
           <w:rFonts w:asciiTheme="majorBidi" w:hAnsiTheme="majorBidi" w:cstheme="majorBidi"/>
           <w:b/>
@@ -503,15 +519,15 @@
           <w:sz w:val="28"/>
           <w:szCs w:val="28"/>
         </w:rPr>
-        <w:t xml:space="preserve"> the number of Pods is always: </w:t>
-      </w:r>
-      <w:r>
-        <w:rPr>
-          <w:rFonts w:asciiTheme="majorBidi" w:hAnsiTheme="majorBidi" w:cstheme="majorBidi"/>
-          <w:sz w:val="28"/>
-          <w:szCs w:val="28"/>
-        </w:rPr>
-        <w:t xml:space="preserve">→ </w:t>
+        <w:t xml:space="preserve"> the number of Pods is always:</w:t>
+      </w:r>
+      <w:r>
+        <w:rPr>
+          <w:rFonts w:asciiTheme="majorBidi" w:hAnsiTheme="majorBidi" w:cstheme="majorBidi"/>
+          <w:sz w:val="28"/>
+          <w:szCs w:val="28"/>
+        </w:rPr>
+        <w:t xml:space="preserve"> </w:t>
       </w:r>
       <w:proofErr w:type="spellStart"/>
       <w:r>
@@ -556,6 +572,7 @@
     </w:p>
     <w:p>
       <w:pPr>
+        <w:jc w:val="both"/>
         <w:rPr>
           <w:rFonts w:asciiTheme="majorBidi" w:hAnsiTheme="majorBidi" w:cstheme="majorBidi"/>
           <w:b/>
@@ -577,6 +594,7 @@
     </w:p>
     <w:p>
       <w:pPr>
+        <w:jc w:val="both"/>
         <w:rPr>
           <w:rFonts w:asciiTheme="majorBidi" w:hAnsiTheme="majorBidi" w:cstheme="majorBidi"/>
           <w:sz w:val="28"/>
@@ -595,7 +613,7 @@
         <mc:AlternateContent>
           <mc:Choice Requires="wps">
             <w:drawing>
-              <wp:anchor distT="0" distB="0" distL="114300" distR="114300" simplePos="0" relativeHeight="251659264" behindDoc="0" locked="0" layoutInCell="1" allowOverlap="1" wp14:anchorId="320A3E73" wp14:editId="5DAD7F7B">
+              <wp:anchor distT="0" distB="0" distL="114300" distR="114300" simplePos="0" relativeHeight="251659264" behindDoc="0" locked="0" layoutInCell="1" allowOverlap="1" wp14:anchorId="320A3E73" wp14:editId="1C3337AF">
                 <wp:simplePos x="0" y="0"/>
                 <wp:positionH relativeFrom="column">
                   <wp:posOffset>-15240</wp:posOffset>
@@ -603,8 +621,8 @@
                 <wp:positionV relativeFrom="paragraph">
                   <wp:posOffset>34925</wp:posOffset>
                 </wp:positionV>
-                <wp:extent cx="2499360" cy="3352800"/>
-                <wp:effectExtent l="0" t="0" r="15240" b="19050"/>
+                <wp:extent cx="3139440" cy="3352800"/>
+                <wp:effectExtent l="0" t="0" r="22860" b="19050"/>
                 <wp:wrapNone/>
                 <wp:docPr id="1458031134" name="Rectangle 1"/>
                 <wp:cNvGraphicFramePr/>
@@ -615,7 +633,7 @@
                       <wps:spPr>
                         <a:xfrm>
                           <a:off x="0" y="0"/>
-                          <a:ext cx="2499360" cy="3352800"/>
+                          <a:ext cx="3139440" cy="3352800"/>
                         </a:xfrm>
                         <a:prstGeom prst="rect">
                           <a:avLst/>
@@ -1199,7 +1217,7 @@
           </mc:Choice>
           <mc:Fallback>
             <w:pict>
-              <v:rect w14:anchorId="320A3E73" id="Rectangle 1" o:spid="_x0000_s1026" style="position:absolute;margin-left:-1.2pt;margin-top:2.75pt;width:196.8pt;height:264pt;z-index:251659264;visibility:visible;mso-wrap-style:square;mso-width-percent:0;mso-height-percent:0;mso-wrap-distance-left:9pt;mso-wrap-distance-top:0;mso-wrap-distance-right:9pt;mso-wrap-distance-bottom:0;mso-position-horizontal:absolute;mso-position-horizontal-relative:text;mso-position-vertical:absolute;mso-position-vertical-relative:text;mso-width-percent:0;mso-height-percent:0;mso-width-relative:margin;mso-height-relative:margin;v-text-anchor:middle" o:gfxdata="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" fillcolor="black [3200]" strokecolor="black [480]" strokeweight="1pt">
+              <v:rect w14:anchorId="320A3E73" id="Rectangle 1" o:spid="_x0000_s1026" style="position:absolute;left:0;text-align:left;margin-left:-1.2pt;margin-top:2.75pt;width:247.2pt;height:264pt;z-index:251659264;visibility:visible;mso-wrap-style:square;mso-width-percent:0;mso-height-percent:0;mso-wrap-distance-left:9pt;mso-wrap-distance-top:0;mso-wrap-distance-right:9pt;mso-wrap-distance-bottom:0;mso-position-horizontal:absolute;mso-position-horizontal-relative:text;mso-position-vertical:absolute;mso-position-vertical-relative:text;mso-width-percent:0;mso-height-percent:0;mso-width-relative:margin;mso-height-relative:margin;v-text-anchor:middle" o:gfxdata="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" fillcolor="black [3200]" strokecolor="black [480]" strokeweight="1pt">
                 <v:textbox>
                   <w:txbxContent>
                     <w:p>
@@ -1750,87 +1768,97 @@
     </w:p>
     <w:p>
       <w:pPr>
-        <w:rPr>
-          <w:rFonts w:asciiTheme="majorBidi" w:hAnsiTheme="majorBidi" w:cstheme="majorBidi"/>
-          <w:sz w:val="28"/>
-          <w:szCs w:val="28"/>
-        </w:rPr>
-      </w:pPr>
-    </w:p>
-    <w:p>
-      <w:pPr>
-        <w:rPr>
-          <w:rFonts w:asciiTheme="majorBidi" w:hAnsiTheme="majorBidi" w:cstheme="majorBidi"/>
-          <w:sz w:val="28"/>
-          <w:szCs w:val="28"/>
-        </w:rPr>
-      </w:pPr>
-    </w:p>
-    <w:p>
-      <w:pPr>
-        <w:rPr>
-          <w:rFonts w:asciiTheme="majorBidi" w:hAnsiTheme="majorBidi" w:cstheme="majorBidi"/>
-          <w:sz w:val="28"/>
-          <w:szCs w:val="28"/>
-        </w:rPr>
-      </w:pPr>
-    </w:p>
-    <w:p>
-      <w:pPr>
-        <w:rPr>
-          <w:rFonts w:asciiTheme="majorBidi" w:hAnsiTheme="majorBidi" w:cstheme="majorBidi"/>
-          <w:sz w:val="28"/>
-          <w:szCs w:val="28"/>
-        </w:rPr>
-      </w:pPr>
-    </w:p>
-    <w:p>
-      <w:pPr>
-        <w:rPr>
-          <w:rFonts w:asciiTheme="majorBidi" w:hAnsiTheme="majorBidi" w:cstheme="majorBidi"/>
-          <w:sz w:val="28"/>
-          <w:szCs w:val="28"/>
-        </w:rPr>
-      </w:pPr>
-    </w:p>
-    <w:p>
-      <w:pPr>
-        <w:rPr>
-          <w:rFonts w:asciiTheme="majorBidi" w:hAnsiTheme="majorBidi" w:cstheme="majorBidi"/>
-          <w:sz w:val="28"/>
-          <w:szCs w:val="28"/>
-        </w:rPr>
-      </w:pPr>
-    </w:p>
-    <w:p>
-      <w:pPr>
-        <w:rPr>
-          <w:rFonts w:asciiTheme="majorBidi" w:hAnsiTheme="majorBidi" w:cstheme="majorBidi"/>
-          <w:sz w:val="28"/>
-          <w:szCs w:val="28"/>
-        </w:rPr>
-      </w:pPr>
-    </w:p>
-    <w:p>
-      <w:pPr>
-        <w:rPr>
-          <w:rFonts w:asciiTheme="majorBidi" w:hAnsiTheme="majorBidi" w:cstheme="majorBidi"/>
-          <w:sz w:val="28"/>
-          <w:szCs w:val="28"/>
-        </w:rPr>
-      </w:pPr>
-    </w:p>
-    <w:p>
-      <w:pPr>
-        <w:rPr>
-          <w:rFonts w:asciiTheme="majorBidi" w:hAnsiTheme="majorBidi" w:cstheme="majorBidi"/>
-          <w:sz w:val="28"/>
-          <w:szCs w:val="28"/>
-        </w:rPr>
-      </w:pPr>
-    </w:p>
-    <w:p>
-      <w:pPr>
+        <w:jc w:val="both"/>
+        <w:rPr>
+          <w:rFonts w:asciiTheme="majorBidi" w:hAnsiTheme="majorBidi" w:cstheme="majorBidi"/>
+          <w:sz w:val="28"/>
+          <w:szCs w:val="28"/>
+        </w:rPr>
+      </w:pPr>
+    </w:p>
+    <w:p>
+      <w:pPr>
+        <w:jc w:val="both"/>
+        <w:rPr>
+          <w:rFonts w:asciiTheme="majorBidi" w:hAnsiTheme="majorBidi" w:cstheme="majorBidi"/>
+          <w:sz w:val="28"/>
+          <w:szCs w:val="28"/>
+        </w:rPr>
+      </w:pPr>
+    </w:p>
+    <w:p>
+      <w:pPr>
+        <w:jc w:val="both"/>
+        <w:rPr>
+          <w:rFonts w:asciiTheme="majorBidi" w:hAnsiTheme="majorBidi" w:cstheme="majorBidi"/>
+          <w:sz w:val="28"/>
+          <w:szCs w:val="28"/>
+        </w:rPr>
+      </w:pPr>
+    </w:p>
+    <w:p>
+      <w:pPr>
+        <w:jc w:val="both"/>
+        <w:rPr>
+          <w:rFonts w:asciiTheme="majorBidi" w:hAnsiTheme="majorBidi" w:cstheme="majorBidi"/>
+          <w:sz w:val="28"/>
+          <w:szCs w:val="28"/>
+        </w:rPr>
+      </w:pPr>
+    </w:p>
+    <w:p>
+      <w:pPr>
+        <w:jc w:val="both"/>
+        <w:rPr>
+          <w:rFonts w:asciiTheme="majorBidi" w:hAnsiTheme="majorBidi" w:cstheme="majorBidi"/>
+          <w:sz w:val="28"/>
+          <w:szCs w:val="28"/>
+        </w:rPr>
+      </w:pPr>
+    </w:p>
+    <w:p>
+      <w:pPr>
+        <w:jc w:val="both"/>
+        <w:rPr>
+          <w:rFonts w:asciiTheme="majorBidi" w:hAnsiTheme="majorBidi" w:cstheme="majorBidi"/>
+          <w:sz w:val="28"/>
+          <w:szCs w:val="28"/>
+        </w:rPr>
+      </w:pPr>
+    </w:p>
+    <w:p>
+      <w:pPr>
+        <w:jc w:val="both"/>
+        <w:rPr>
+          <w:rFonts w:asciiTheme="majorBidi" w:hAnsiTheme="majorBidi" w:cstheme="majorBidi"/>
+          <w:sz w:val="28"/>
+          <w:szCs w:val="28"/>
+        </w:rPr>
+      </w:pPr>
+    </w:p>
+    <w:p>
+      <w:pPr>
+        <w:jc w:val="both"/>
+        <w:rPr>
+          <w:rFonts w:asciiTheme="majorBidi" w:hAnsiTheme="majorBidi" w:cstheme="majorBidi"/>
+          <w:sz w:val="28"/>
+          <w:szCs w:val="28"/>
+        </w:rPr>
+      </w:pPr>
+    </w:p>
+    <w:p>
+      <w:pPr>
+        <w:jc w:val="both"/>
+        <w:rPr>
+          <w:rFonts w:asciiTheme="majorBidi" w:hAnsiTheme="majorBidi" w:cstheme="majorBidi"/>
+          <w:sz w:val="28"/>
+          <w:szCs w:val="28"/>
+        </w:rPr>
+      </w:pPr>
+    </w:p>
+    <w:p>
+      <w:pPr>
+        <w:jc w:val="both"/>
         <w:rPr>
           <w:rFonts w:asciiTheme="majorBidi" w:hAnsiTheme="majorBidi" w:cstheme="majorBidi"/>
           <w:sz w:val="28"/>
@@ -2330,6 +2358,7 @@
     </w:p>
     <w:p>
       <w:pPr>
+        <w:jc w:val="both"/>
         <w:rPr>
           <w:rFonts w:asciiTheme="majorBidi" w:hAnsiTheme="majorBidi" w:cstheme="majorBidi"/>
           <w:sz w:val="28"/>
@@ -2340,16 +2369,18 @@
     <w:p>
       <w:pPr>
         <w:spacing w:after="60"/>
-        <w:rPr>
-          <w:rFonts w:asciiTheme="majorBidi" w:hAnsiTheme="majorBidi" w:cstheme="majorBidi"/>
-          <w:sz w:val="40"/>
-          <w:szCs w:val="40"/>
+        <w:jc w:val="both"/>
+        <w:rPr>
+          <w:rFonts w:asciiTheme="majorBidi" w:hAnsiTheme="majorBidi" w:cstheme="majorBidi"/>
+          <w:sz w:val="48"/>
+          <w:szCs w:val="48"/>
         </w:rPr>
       </w:pPr>
     </w:p>
     <w:p>
       <w:pPr>
         <w:spacing w:after="60"/>
+        <w:jc w:val="both"/>
         <w:rPr>
           <w:rFonts w:asciiTheme="majorBidi" w:hAnsiTheme="majorBidi" w:cstheme="majorBidi"/>
           <w:sz w:val="28"/>
@@ -2392,6 +2423,7 @@
     <w:p>
       <w:pPr>
         <w:spacing w:after="60"/>
+        <w:jc w:val="both"/>
         <w:rPr>
           <w:rFonts w:asciiTheme="majorBidi" w:hAnsiTheme="majorBidi" w:cstheme="majorBidi"/>
           <w:b/>
@@ -2410,10 +2442,21 @@
         </w:rPr>
         <w:t>Scheduling Behavior</w:t>
       </w:r>
+      <w:r>
+        <w:rPr>
+          <w:rFonts w:asciiTheme="majorBidi" w:hAnsiTheme="majorBidi" w:cstheme="majorBidi"/>
+          <w:b/>
+          <w:bCs/>
+          <w:sz w:val="32"/>
+          <w:szCs w:val="32"/>
+        </w:rPr>
+        <w:t>:</w:t>
+      </w:r>
     </w:p>
     <w:p>
       <w:pPr>
         <w:spacing w:after="0"/>
+        <w:jc w:val="both"/>
         <w:rPr>
           <w:rFonts w:asciiTheme="majorBidi" w:hAnsiTheme="majorBidi" w:cstheme="majorBidi"/>
           <w:sz w:val="28"/>
@@ -2454,6 +2497,7 @@
         </w:numPr>
         <w:spacing w:after="60"/>
         <w:ind w:left="360"/>
+        <w:jc w:val="both"/>
         <w:rPr>
           <w:rFonts w:asciiTheme="majorBidi" w:hAnsiTheme="majorBidi" w:cstheme="majorBidi"/>
           <w:b/>
@@ -2484,6 +2528,7 @@
         </w:numPr>
         <w:spacing w:after="60"/>
         <w:ind w:left="360"/>
+        <w:jc w:val="both"/>
         <w:rPr>
           <w:rFonts w:asciiTheme="majorBidi" w:hAnsiTheme="majorBidi" w:cstheme="majorBidi"/>
           <w:b/>
@@ -2514,6 +2559,7 @@
         </w:numPr>
         <w:spacing w:after="0"/>
         <w:ind w:left="360"/>
+        <w:jc w:val="both"/>
         <w:rPr>
           <w:rFonts w:asciiTheme="majorBidi" w:hAnsiTheme="majorBidi" w:cstheme="majorBidi"/>
           <w:b/>
@@ -2535,6 +2581,7 @@
     </w:p>
     <w:p>
       <w:pPr>
+        <w:jc w:val="both"/>
         <w:rPr>
           <w:rFonts w:asciiTheme="majorBidi" w:hAnsiTheme="majorBidi" w:cstheme="majorBidi"/>
           <w:sz w:val="28"/>
@@ -2847,15 +2894,17 @@
     </w:p>
     <w:p>
       <w:pPr>
-        <w:rPr>
-          <w:rFonts w:asciiTheme="majorBidi" w:hAnsiTheme="majorBidi" w:cstheme="majorBidi"/>
-          <w:sz w:val="28"/>
-          <w:szCs w:val="28"/>
-        </w:rPr>
-      </w:pPr>
-    </w:p>
-    <w:p>
-      <w:pPr>
+        <w:jc w:val="both"/>
+        <w:rPr>
+          <w:rFonts w:asciiTheme="majorBidi" w:hAnsiTheme="majorBidi" w:cstheme="majorBidi"/>
+          <w:sz w:val="28"/>
+          <w:szCs w:val="28"/>
+        </w:rPr>
+      </w:pPr>
+    </w:p>
+    <w:p>
+      <w:pPr>
+        <w:jc w:val="both"/>
         <w:rPr>
           <w:rFonts w:asciiTheme="majorBidi" w:hAnsiTheme="majorBidi" w:cstheme="majorBidi"/>
           <w:sz w:val="12"/>
@@ -2866,6 +2915,7 @@
     <w:p>
       <w:pPr>
         <w:spacing w:after="120"/>
+        <w:jc w:val="both"/>
         <w:rPr>
           <w:rFonts w:asciiTheme="majorBidi" w:hAnsiTheme="majorBidi" w:cstheme="majorBidi"/>
           <w:b/>
@@ -3084,7 +3134,19 @@
                 <w:sz w:val="28"/>
                 <w:szCs w:val="28"/>
               </w:rPr>
-              <w:t>Defined by replicas</w:t>
+              <w:t xml:space="preserve">Defined by </w:t>
+            </w:r>
+            <w:r>
+              <w:rPr>
+                <w:rFonts w:asciiTheme="majorBidi" w:hAnsiTheme="majorBidi" w:cstheme="majorBidi"/>
+                <w:b/>
+                <w:bCs/>
+                <w:i/>
+                <w:iCs/>
+                <w:sz w:val="28"/>
+                <w:szCs w:val="28"/>
+              </w:rPr>
+              <w:t>replicas</w:t>
             </w:r>
           </w:p>
         </w:tc>
@@ -3479,7 +3541,27 @@
           <w:sz w:val="28"/>
           <w:szCs w:val="28"/>
         </w:rPr>
-        <w:t>No replicas field</w:t>
+        <w:t xml:space="preserve">No </w:t>
+      </w:r>
+      <w:r>
+        <w:rPr>
+          <w:rFonts w:asciiTheme="majorBidi" w:hAnsiTheme="majorBidi" w:cstheme="majorBidi"/>
+          <w:b/>
+          <w:bCs/>
+          <w:i/>
+          <w:iCs/>
+          <w:sz w:val="28"/>
+          <w:szCs w:val="28"/>
+        </w:rPr>
+        <w:t>replicas</w:t>
+      </w:r>
+      <w:r>
+        <w:rPr>
+          <w:rFonts w:asciiTheme="majorBidi" w:hAnsiTheme="majorBidi" w:cstheme="majorBidi"/>
+          <w:sz w:val="28"/>
+          <w:szCs w:val="28"/>
+        </w:rPr>
+        <w:t xml:space="preserve"> field</w:t>
       </w:r>
     </w:p>
     <w:p>
@@ -3659,6 +3741,8 @@
       <w:r>
         <w:rPr>
           <w:rFonts w:asciiTheme="majorBidi" w:hAnsiTheme="majorBidi" w:cstheme="majorBidi"/>
+          <w:b/>
+          <w:bCs/>
           <w:sz w:val="28"/>
           <w:szCs w:val="28"/>
         </w:rPr>
@@ -3698,6 +3782,8 @@
           <w:rFonts w:asciiTheme="majorBidi" w:hAnsiTheme="majorBidi" w:cstheme="majorBidi"/>
           <w:b/>
           <w:bCs/>
+          <w:i/>
+          <w:iCs/>
           <w:sz w:val="36"/>
           <w:szCs w:val="36"/>
         </w:rPr>
@@ -3738,6 +3824,10 @@
       <w:r>
         <w:rPr>
           <w:rFonts w:asciiTheme="majorBidi" w:hAnsiTheme="majorBidi" w:cstheme="majorBidi"/>
+          <w:b/>
+          <w:bCs/>
+          <w:i/>
+          <w:iCs/>
           <w:sz w:val="28"/>
           <w:szCs w:val="28"/>
         </w:rPr>
@@ -4363,6 +4453,10 @@
       <w:r>
         <w:rPr>
           <w:rFonts w:asciiTheme="majorBidi" w:hAnsiTheme="majorBidi" w:cstheme="majorBidi"/>
+          <w:b/>
+          <w:bCs/>
+          <w:i/>
+          <w:iCs/>
           <w:sz w:val="28"/>
           <w:szCs w:val="28"/>
         </w:rPr>
@@ -4378,6 +4472,7 @@
           <w:rFonts w:asciiTheme="majorBidi" w:hAnsiTheme="majorBidi" w:cstheme="majorBidi"/>
           <w:sz w:val="28"/>
           <w:szCs w:val="28"/>
+          <w:u w:val="single"/>
         </w:rPr>
       </w:pPr>
       <w:r>
@@ -4386,6 +4481,7 @@
           <w:noProof/>
           <w:sz w:val="28"/>
           <w:szCs w:val="28"/>
+          <w:u w:val="single"/>
         </w:rPr>
         <mc:AlternateContent>
           <mc:Choice Requires="wps">
@@ -4884,6 +4980,7 @@
           <w:rFonts w:asciiTheme="majorBidi" w:hAnsiTheme="majorBidi" w:cstheme="majorBidi"/>
           <w:sz w:val="28"/>
           <w:szCs w:val="28"/>
+          <w:u w:val="single"/>
         </w:rPr>
         <w:t>Example:</w:t>
       </w:r>
@@ -4964,18 +5061,14 @@
         </w:rPr>
         <w:t>2 pods can be unavailable during the update</w:t>
       </w:r>
-    </w:p>
-    <w:p>
-      <w:pPr>
-        <w:spacing w:after="80"/>
-        <w:ind w:left="360"/>
-        <w:jc w:val="both"/>
-        <w:rPr>
-          <w:rFonts w:asciiTheme="majorBidi" w:hAnsiTheme="majorBidi" w:cstheme="majorBidi"/>
-          <w:sz w:val="28"/>
-          <w:szCs w:val="28"/>
-        </w:rPr>
-      </w:pPr>
+      <w:r>
+        <w:rPr>
+          <w:rFonts w:asciiTheme="majorBidi" w:hAnsiTheme="majorBidi" w:cstheme="majorBidi"/>
+          <w:sz w:val="28"/>
+          <w:szCs w:val="28"/>
+        </w:rPr>
+        <w:t xml:space="preserve">. </w:t>
+      </w:r>
       <w:r>
         <w:rPr>
           <w:rFonts w:asciiTheme="majorBidi" w:hAnsiTheme="majorBidi" w:cstheme="majorBidi"/>
@@ -5251,6 +5344,7 @@
           <w:sz w:val="28"/>
           <w:szCs w:val="28"/>
         </w:rPr>
+        <w:lastRenderedPageBreak/>
         <w:t>New Pod is created</w:t>
       </w:r>
     </w:p>
@@ -5272,7 +5366,6 @@
           <w:sz w:val="28"/>
           <w:szCs w:val="28"/>
         </w:rPr>
-        <w:lastRenderedPageBreak/>
         <w:t>So</w:t>
       </w:r>
       <w:proofErr w:type="gramEnd"/>
@@ -5750,6 +5843,7 @@
     </w:p>
     <w:p>
       <w:pPr>
+        <w:spacing w:after="80"/>
         <w:ind w:left="360"/>
         <w:jc w:val="both"/>
         <w:rPr>
@@ -5778,7 +5872,615 @@
           <w:sz w:val="28"/>
           <w:szCs w:val="28"/>
         </w:rPr>
-        <w:t xml:space="preserve"> in a DaemonSet allows Kubernetes to create the new Pod on a node before deleting the old one, temporarily running two Pods on the same node during updates to prevent service gaps.</w:t>
+        <w:t xml:space="preserve"> in a </w:t>
+      </w:r>
+      <w:proofErr w:type="spellStart"/>
+      <w:r>
+        <w:rPr>
+          <w:rFonts w:asciiTheme="majorBidi" w:hAnsiTheme="majorBidi" w:cstheme="majorBidi"/>
+          <w:sz w:val="28"/>
+          <w:szCs w:val="28"/>
+        </w:rPr>
+        <w:t>DaemonSet</w:t>
+      </w:r>
+      <w:proofErr w:type="spellEnd"/>
+      <w:r>
+        <w:rPr>
+          <w:rFonts w:asciiTheme="majorBidi" w:hAnsiTheme="majorBidi" w:cstheme="majorBidi"/>
+          <w:sz w:val="28"/>
+          <w:szCs w:val="28"/>
+        </w:rPr>
+        <w:t xml:space="preserve"> allows Kubernetes to create the new Pod on a node before deleting the old one, temporarily running two Pods on the same node during updates to prevent service gaps.</w:t>
+      </w:r>
+    </w:p>
+    <w:p>
+      <w:pPr>
+        <w:pStyle w:val="ListParagraph"/>
+        <w:numPr>
+          <w:ilvl w:val="0"/>
+          <w:numId w:val="27"/>
+        </w:numPr>
+        <w:spacing w:after="60"/>
+        <w:ind w:left="720"/>
+        <w:jc w:val="both"/>
+        <w:rPr>
+          <w:rFonts w:asciiTheme="majorBidi" w:hAnsiTheme="majorBidi" w:cstheme="majorBidi"/>
+          <w:sz w:val="28"/>
+          <w:szCs w:val="28"/>
+        </w:rPr>
+      </w:pPr>
+      <w:r>
+        <w:rPr>
+          <w:rFonts w:asciiTheme="majorBidi" w:hAnsiTheme="majorBidi" w:cstheme="majorBidi"/>
+          <w:sz w:val="28"/>
+          <w:szCs w:val="28"/>
+        </w:rPr>
+        <w:t xml:space="preserve">Suppose you have a </w:t>
+      </w:r>
+      <w:proofErr w:type="spellStart"/>
+      <w:r>
+        <w:rPr>
+          <w:rFonts w:asciiTheme="majorBidi" w:hAnsiTheme="majorBidi" w:cstheme="majorBidi"/>
+          <w:sz w:val="28"/>
+          <w:szCs w:val="28"/>
+        </w:rPr>
+        <w:t>DaemonSet</w:t>
+      </w:r>
+      <w:proofErr w:type="spellEnd"/>
+      <w:r>
+        <w:rPr>
+          <w:rFonts w:asciiTheme="majorBidi" w:hAnsiTheme="majorBidi" w:cstheme="majorBidi"/>
+          <w:sz w:val="28"/>
+          <w:szCs w:val="28"/>
+        </w:rPr>
+        <w:t xml:space="preserve"> with one Pod per node</w:t>
+      </w:r>
+      <w:r>
+        <w:rPr>
+          <w:rFonts w:asciiTheme="majorBidi" w:hAnsiTheme="majorBidi" w:cstheme="majorBidi"/>
+          <w:sz w:val="28"/>
+          <w:szCs w:val="28"/>
+        </w:rPr>
+        <w:t xml:space="preserve"> and then y</w:t>
+      </w:r>
+      <w:r>
+        <w:rPr>
+          <w:rFonts w:asciiTheme="majorBidi" w:hAnsiTheme="majorBidi" w:cstheme="majorBidi"/>
+          <w:sz w:val="28"/>
+          <w:szCs w:val="28"/>
+        </w:rPr>
+        <w:t>ou configure</w:t>
+      </w:r>
+      <w:r>
+        <w:rPr>
+          <w:rFonts w:asciiTheme="majorBidi" w:hAnsiTheme="majorBidi" w:cstheme="majorBidi"/>
+          <w:sz w:val="28"/>
+          <w:szCs w:val="28"/>
+        </w:rPr>
+        <w:t xml:space="preserve"> </w:t>
+      </w:r>
+      <w:proofErr w:type="spellStart"/>
+      <w:r>
+        <w:rPr>
+          <w:rFonts w:asciiTheme="majorBidi" w:hAnsiTheme="majorBidi" w:cstheme="majorBidi"/>
+          <w:b/>
+          <w:bCs/>
+          <w:i/>
+          <w:iCs/>
+          <w:sz w:val="28"/>
+          <w:szCs w:val="28"/>
+        </w:rPr>
+        <w:t>maxSurge</w:t>
+      </w:r>
+      <w:proofErr w:type="spellEnd"/>
+      <w:r>
+        <w:rPr>
+          <w:rFonts w:asciiTheme="majorBidi" w:hAnsiTheme="majorBidi" w:cstheme="majorBidi"/>
+          <w:b/>
+          <w:bCs/>
+          <w:i/>
+          <w:iCs/>
+          <w:sz w:val="28"/>
+          <w:szCs w:val="28"/>
+        </w:rPr>
+        <w:t>: 1</w:t>
+      </w:r>
+      <w:r>
+        <w:rPr>
+          <w:rFonts w:asciiTheme="majorBidi" w:hAnsiTheme="majorBidi" w:cstheme="majorBidi"/>
+          <w:sz w:val="28"/>
+          <w:szCs w:val="28"/>
+        </w:rPr>
+        <w:t xml:space="preserve"> </w:t>
+      </w:r>
+      <w:r>
+        <w:rPr>
+          <w:rFonts w:asciiTheme="majorBidi" w:hAnsiTheme="majorBidi" w:cstheme="majorBidi"/>
+          <w:sz w:val="28"/>
+          <w:szCs w:val="28"/>
+        </w:rPr>
+        <w:t xml:space="preserve">and update the </w:t>
+      </w:r>
+      <w:proofErr w:type="spellStart"/>
+      <w:r>
+        <w:rPr>
+          <w:rFonts w:asciiTheme="majorBidi" w:hAnsiTheme="majorBidi" w:cstheme="majorBidi"/>
+          <w:sz w:val="28"/>
+          <w:szCs w:val="28"/>
+        </w:rPr>
+        <w:t>DaemonSet</w:t>
+      </w:r>
+      <w:proofErr w:type="spellEnd"/>
+      <w:r>
+        <w:rPr>
+          <w:rFonts w:asciiTheme="majorBidi" w:hAnsiTheme="majorBidi" w:cstheme="majorBidi"/>
+          <w:sz w:val="28"/>
+          <w:szCs w:val="28"/>
+        </w:rPr>
+        <w:t xml:space="preserve"> image.</w:t>
+      </w:r>
+    </w:p>
+    <w:p>
+      <w:pPr>
+        <w:spacing w:after="60"/>
+        <w:ind w:left="720"/>
+        <w:jc w:val="both"/>
+        <w:rPr>
+          <w:rFonts w:asciiTheme="majorBidi" w:hAnsiTheme="majorBidi" w:cstheme="majorBidi"/>
+          <w:sz w:val="28"/>
+          <w:szCs w:val="28"/>
+        </w:rPr>
+      </w:pPr>
+      <w:r>
+        <w:rPr>
+          <w:rFonts w:asciiTheme="majorBidi" w:hAnsiTheme="majorBidi" w:cstheme="majorBidi"/>
+          <w:sz w:val="28"/>
+          <w:szCs w:val="28"/>
+        </w:rPr>
+        <w:t xml:space="preserve">First </w:t>
+      </w:r>
+      <w:r>
+        <w:rPr>
+          <w:rFonts w:asciiTheme="majorBidi" w:hAnsiTheme="majorBidi" w:cstheme="majorBidi"/>
+          <w:sz w:val="28"/>
+          <w:szCs w:val="28"/>
+        </w:rPr>
+        <w:t>On Node1, Kubernetes creates a new Pod (v2) before deleting the old one:</w:t>
+      </w:r>
+    </w:p>
+    <w:p>
+      <w:pPr>
+        <w:spacing w:after="0"/>
+        <w:ind w:left="720"/>
+        <w:jc w:val="both"/>
+        <w:rPr>
+          <w:rFonts w:asciiTheme="majorBidi" w:hAnsiTheme="majorBidi" w:cstheme="majorBidi"/>
+          <w:sz w:val="28"/>
+          <w:szCs w:val="28"/>
+        </w:rPr>
+      </w:pPr>
+      <w:r>
+        <w:rPr>
+          <w:rFonts w:asciiTheme="majorBidi" w:hAnsiTheme="majorBidi" w:cstheme="majorBidi"/>
+          <w:sz w:val="28"/>
+          <w:szCs w:val="28"/>
+        </w:rPr>
+        <w:t>Node1</w:t>
+      </w:r>
+    </w:p>
+    <w:p>
+      <w:pPr>
+        <w:spacing w:after="0"/>
+        <w:ind w:left="720"/>
+        <w:jc w:val="both"/>
+        <w:rPr>
+          <w:rFonts w:asciiTheme="majorBidi" w:hAnsiTheme="majorBidi" w:cstheme="majorBidi"/>
+          <w:sz w:val="28"/>
+          <w:szCs w:val="28"/>
+        </w:rPr>
+      </w:pPr>
+      <w:r>
+        <w:rPr>
+          <w:rFonts w:asciiTheme="majorBidi" w:hAnsiTheme="majorBidi" w:cstheme="majorBidi"/>
+          <w:sz w:val="28"/>
+          <w:szCs w:val="28"/>
+        </w:rPr>
+        <w:t>├── Pod A (v1)</w:t>
+      </w:r>
+    </w:p>
+    <w:p>
+      <w:pPr>
+        <w:spacing w:after="60"/>
+        <w:ind w:left="720"/>
+        <w:jc w:val="both"/>
+        <w:rPr>
+          <w:rFonts w:asciiTheme="majorBidi" w:hAnsiTheme="majorBidi" w:cstheme="majorBidi"/>
+          <w:sz w:val="28"/>
+          <w:szCs w:val="28"/>
+        </w:rPr>
+      </w:pPr>
+      <w:r>
+        <w:rPr>
+          <w:rFonts w:asciiTheme="majorBidi" w:hAnsiTheme="majorBidi" w:cstheme="majorBidi"/>
+          <w:sz w:val="28"/>
+          <w:szCs w:val="28"/>
+        </w:rPr>
+        <w:t>└── Pod A' (v2)</w:t>
+      </w:r>
+    </w:p>
+    <w:p>
+      <w:pPr>
+        <w:spacing w:after="80"/>
+        <w:ind w:left="360" w:firstLine="360"/>
+        <w:jc w:val="both"/>
+        <w:rPr>
+          <w:rFonts w:asciiTheme="majorBidi" w:hAnsiTheme="majorBidi" w:cstheme="majorBidi"/>
+          <w:sz w:val="28"/>
+          <w:szCs w:val="28"/>
+        </w:rPr>
+      </w:pPr>
+      <w:r>
+        <w:rPr>
+          <w:rFonts w:asciiTheme="majorBidi" w:hAnsiTheme="majorBidi" w:cstheme="majorBidi"/>
+          <w:sz w:val="28"/>
+          <w:szCs w:val="28"/>
+        </w:rPr>
+        <w:t>For a short time, both Pods exist on the same node.</w:t>
+      </w:r>
+    </w:p>
+    <w:p>
+      <w:pPr>
+        <w:spacing w:after="80"/>
+        <w:ind w:left="360"/>
+        <w:jc w:val="both"/>
+        <w:rPr>
+          <w:rFonts w:asciiTheme="majorBidi" w:hAnsiTheme="majorBidi" w:cstheme="majorBidi"/>
+          <w:sz w:val="28"/>
+          <w:szCs w:val="28"/>
+        </w:rPr>
+      </w:pPr>
+      <w:r>
+        <w:rPr>
+          <w:rFonts w:asciiTheme="majorBidi" w:hAnsiTheme="majorBidi" w:cstheme="majorBidi"/>
+          <w:sz w:val="28"/>
+          <w:szCs w:val="28"/>
+        </w:rPr>
+        <w:t>The new Pod starts and must become Ready.</w:t>
+      </w:r>
+      <w:r>
+        <w:rPr>
+          <w:rFonts w:asciiTheme="majorBidi" w:hAnsiTheme="majorBidi" w:cstheme="majorBidi"/>
+          <w:sz w:val="28"/>
+          <w:szCs w:val="28"/>
+        </w:rPr>
+        <w:t xml:space="preserve"> </w:t>
+      </w:r>
+      <w:r>
+        <w:rPr>
+          <w:rFonts w:asciiTheme="majorBidi" w:hAnsiTheme="majorBidi" w:cstheme="majorBidi"/>
+          <w:sz w:val="28"/>
+          <w:szCs w:val="28"/>
+        </w:rPr>
+        <w:t>Until it is Ready</w:t>
+      </w:r>
+      <w:r>
+        <w:rPr>
+          <w:rFonts w:asciiTheme="majorBidi" w:hAnsiTheme="majorBidi" w:cstheme="majorBidi"/>
+          <w:sz w:val="28"/>
+          <w:szCs w:val="28"/>
+        </w:rPr>
+        <w:t xml:space="preserve"> t</w:t>
+      </w:r>
+      <w:r>
+        <w:rPr>
+          <w:rFonts w:asciiTheme="majorBidi" w:hAnsiTheme="majorBidi" w:cstheme="majorBidi"/>
+          <w:sz w:val="28"/>
+          <w:szCs w:val="28"/>
+        </w:rPr>
+        <w:t>he old Pod continues serving traffic</w:t>
+      </w:r>
+      <w:r>
+        <w:rPr>
+          <w:rFonts w:asciiTheme="majorBidi" w:hAnsiTheme="majorBidi" w:cstheme="majorBidi"/>
+          <w:sz w:val="28"/>
+          <w:szCs w:val="28"/>
+        </w:rPr>
+        <w:t xml:space="preserve"> and t</w:t>
+      </w:r>
+      <w:r>
+        <w:rPr>
+          <w:rFonts w:asciiTheme="majorBidi" w:hAnsiTheme="majorBidi" w:cstheme="majorBidi"/>
+          <w:sz w:val="28"/>
+          <w:szCs w:val="28"/>
+        </w:rPr>
+        <w:t>he new Pod is not added to the Service endpoints.</w:t>
+      </w:r>
+    </w:p>
+    <w:p>
+      <w:pPr>
+        <w:spacing w:after="80"/>
+        <w:ind w:left="360"/>
+        <w:jc w:val="both"/>
+        <w:rPr>
+          <w:rFonts w:asciiTheme="majorBidi" w:hAnsiTheme="majorBidi" w:cstheme="majorBidi"/>
+          <w:sz w:val="28"/>
+          <w:szCs w:val="28"/>
+        </w:rPr>
+      </w:pPr>
+      <w:r>
+        <w:rPr>
+          <w:rFonts w:asciiTheme="majorBidi" w:hAnsiTheme="majorBidi" w:cstheme="majorBidi"/>
+          <w:sz w:val="28"/>
+          <w:szCs w:val="28"/>
+        </w:rPr>
+        <w:t>Once the readiness probe succeeds</w:t>
+      </w:r>
+      <w:r>
+        <w:rPr>
+          <w:rFonts w:asciiTheme="majorBidi" w:hAnsiTheme="majorBidi" w:cstheme="majorBidi"/>
+          <w:sz w:val="28"/>
+          <w:szCs w:val="28"/>
+        </w:rPr>
+        <w:t xml:space="preserve"> t</w:t>
+      </w:r>
+      <w:r>
+        <w:rPr>
+          <w:rFonts w:asciiTheme="majorBidi" w:hAnsiTheme="majorBidi" w:cstheme="majorBidi"/>
+          <w:sz w:val="28"/>
+          <w:szCs w:val="28"/>
+        </w:rPr>
+        <w:t>he new Pod is added to the Service endpoints</w:t>
+      </w:r>
+      <w:r>
+        <w:rPr>
+          <w:rFonts w:asciiTheme="majorBidi" w:hAnsiTheme="majorBidi" w:cstheme="majorBidi"/>
+          <w:sz w:val="28"/>
+          <w:szCs w:val="28"/>
+        </w:rPr>
+        <w:t xml:space="preserve"> and t</w:t>
+      </w:r>
+      <w:r>
+        <w:rPr>
+          <w:rFonts w:asciiTheme="majorBidi" w:hAnsiTheme="majorBidi" w:cstheme="majorBidi"/>
+          <w:sz w:val="28"/>
+          <w:szCs w:val="28"/>
+        </w:rPr>
+        <w:t>he old Pod is selected for termination.</w:t>
+      </w:r>
+      <w:r>
+        <w:rPr>
+          <w:rFonts w:asciiTheme="majorBidi" w:hAnsiTheme="majorBidi" w:cstheme="majorBidi"/>
+          <w:sz w:val="28"/>
+          <w:szCs w:val="28"/>
+        </w:rPr>
+        <w:t xml:space="preserve"> </w:t>
+      </w:r>
+      <w:r>
+        <w:rPr>
+          <w:rFonts w:asciiTheme="majorBidi" w:hAnsiTheme="majorBidi" w:cstheme="majorBidi"/>
+          <w:sz w:val="28"/>
+          <w:szCs w:val="28"/>
+        </w:rPr>
+        <w:t>For a brief period, both Pods may be Ready and both may appear as Service endpoints. This overlap is intentional and helps avoid downtime.</w:t>
+      </w:r>
+    </w:p>
+    <w:p>
+      <w:pPr>
+        <w:spacing w:after="80"/>
+        <w:ind w:left="360"/>
+        <w:jc w:val="both"/>
+        <w:rPr>
+          <w:rFonts w:asciiTheme="majorBidi" w:hAnsiTheme="majorBidi" w:cstheme="majorBidi"/>
+          <w:sz w:val="28"/>
+          <w:szCs w:val="28"/>
+        </w:rPr>
+      </w:pPr>
+      <w:r>
+        <w:rPr>
+          <w:rFonts w:asciiTheme="majorBidi" w:hAnsiTheme="majorBidi" w:cstheme="majorBidi"/>
+          <w:sz w:val="28"/>
+          <w:szCs w:val="28"/>
+        </w:rPr>
+        <w:t>The old Pod begins graceful termination</w:t>
+      </w:r>
+      <w:r>
+        <w:rPr>
+          <w:rFonts w:asciiTheme="majorBidi" w:hAnsiTheme="majorBidi" w:cstheme="majorBidi"/>
+          <w:sz w:val="28"/>
+          <w:szCs w:val="28"/>
+        </w:rPr>
+        <w:t xml:space="preserve">. </w:t>
+      </w:r>
+      <w:r>
+        <w:rPr>
+          <w:rFonts w:asciiTheme="majorBidi" w:hAnsiTheme="majorBidi" w:cstheme="majorBidi"/>
+          <w:sz w:val="28"/>
+          <w:szCs w:val="28"/>
+        </w:rPr>
+        <w:t xml:space="preserve">It is removed from the Service endpoints (or marked as terminating, depending on </w:t>
+      </w:r>
+      <w:proofErr w:type="spellStart"/>
+      <w:r>
+        <w:rPr>
+          <w:rFonts w:asciiTheme="majorBidi" w:hAnsiTheme="majorBidi" w:cstheme="majorBidi"/>
+          <w:b/>
+          <w:bCs/>
+          <w:i/>
+          <w:iCs/>
+          <w:sz w:val="28"/>
+          <w:szCs w:val="28"/>
+        </w:rPr>
+        <w:t>EndpointSlice</w:t>
+      </w:r>
+      <w:proofErr w:type="spellEnd"/>
+      <w:r>
+        <w:rPr>
+          <w:rFonts w:asciiTheme="majorBidi" w:hAnsiTheme="majorBidi" w:cstheme="majorBidi"/>
+          <w:sz w:val="28"/>
+          <w:szCs w:val="28"/>
+        </w:rPr>
+        <w:t xml:space="preserve"> behavior and the consumer).</w:t>
+      </w:r>
+      <w:r>
+        <w:rPr>
+          <w:rFonts w:asciiTheme="majorBidi" w:hAnsiTheme="majorBidi" w:cstheme="majorBidi"/>
+          <w:sz w:val="28"/>
+          <w:szCs w:val="28"/>
+        </w:rPr>
+        <w:t xml:space="preserve"> </w:t>
+      </w:r>
+      <w:proofErr w:type="spellStart"/>
+      <w:r>
+        <w:rPr>
+          <w:rFonts w:asciiTheme="majorBidi" w:hAnsiTheme="majorBidi" w:cstheme="majorBidi"/>
+          <w:sz w:val="28"/>
+          <w:szCs w:val="28"/>
+        </w:rPr>
+        <w:t>kubelet</w:t>
+      </w:r>
+      <w:proofErr w:type="spellEnd"/>
+      <w:r>
+        <w:rPr>
+          <w:rFonts w:asciiTheme="majorBidi" w:hAnsiTheme="majorBidi" w:cstheme="majorBidi"/>
+          <w:sz w:val="28"/>
+          <w:szCs w:val="28"/>
+        </w:rPr>
+        <w:t xml:space="preserve"> runs the </w:t>
+      </w:r>
+      <w:proofErr w:type="spellStart"/>
+      <w:r>
+        <w:rPr>
+          <w:rFonts w:asciiTheme="majorBidi" w:hAnsiTheme="majorBidi" w:cstheme="majorBidi"/>
+          <w:sz w:val="28"/>
+          <w:szCs w:val="28"/>
+        </w:rPr>
+        <w:t>preStop</w:t>
+      </w:r>
+      <w:proofErr w:type="spellEnd"/>
+      <w:r>
+        <w:rPr>
+          <w:rFonts w:asciiTheme="majorBidi" w:hAnsiTheme="majorBidi" w:cstheme="majorBidi"/>
+          <w:sz w:val="28"/>
+          <w:szCs w:val="28"/>
+        </w:rPr>
+        <w:t xml:space="preserve"> hook (if configured).</w:t>
+      </w:r>
+      <w:r>
+        <w:rPr>
+          <w:rFonts w:asciiTheme="majorBidi" w:hAnsiTheme="majorBidi" w:cstheme="majorBidi"/>
+          <w:sz w:val="28"/>
+          <w:szCs w:val="28"/>
+        </w:rPr>
+        <w:t xml:space="preserve"> Then </w:t>
+      </w:r>
+      <w:proofErr w:type="spellStart"/>
+      <w:r>
+        <w:rPr>
+          <w:rFonts w:asciiTheme="majorBidi" w:hAnsiTheme="majorBidi" w:cstheme="majorBidi"/>
+          <w:sz w:val="28"/>
+          <w:szCs w:val="28"/>
+        </w:rPr>
+        <w:t>kubelet</w:t>
+      </w:r>
+      <w:proofErr w:type="spellEnd"/>
+      <w:r>
+        <w:rPr>
+          <w:rFonts w:asciiTheme="majorBidi" w:hAnsiTheme="majorBidi" w:cstheme="majorBidi"/>
+          <w:sz w:val="28"/>
+          <w:szCs w:val="28"/>
+        </w:rPr>
+        <w:t xml:space="preserve"> sends SIGTERM.</w:t>
+      </w:r>
+      <w:r>
+        <w:rPr>
+          <w:rFonts w:asciiTheme="majorBidi" w:hAnsiTheme="majorBidi" w:cstheme="majorBidi"/>
+          <w:sz w:val="28"/>
+          <w:szCs w:val="28"/>
+        </w:rPr>
+        <w:t xml:space="preserve"> </w:t>
+      </w:r>
+      <w:r>
+        <w:rPr>
+          <w:rFonts w:asciiTheme="majorBidi" w:hAnsiTheme="majorBidi" w:cstheme="majorBidi"/>
+          <w:sz w:val="28"/>
+          <w:szCs w:val="28"/>
+        </w:rPr>
+        <w:t xml:space="preserve">The Pod exits gracefully or is eventually force-killed after </w:t>
+      </w:r>
+      <w:proofErr w:type="spellStart"/>
+      <w:r>
+        <w:rPr>
+          <w:rFonts w:asciiTheme="majorBidi" w:hAnsiTheme="majorBidi" w:cstheme="majorBidi"/>
+          <w:b/>
+          <w:bCs/>
+          <w:i/>
+          <w:iCs/>
+          <w:sz w:val="28"/>
+          <w:szCs w:val="28"/>
+        </w:rPr>
+        <w:t>terminationGracePeriodSeconds</w:t>
+      </w:r>
+      <w:proofErr w:type="spellEnd"/>
+      <w:r>
+        <w:rPr>
+          <w:rFonts w:asciiTheme="majorBidi" w:hAnsiTheme="majorBidi" w:cstheme="majorBidi"/>
+          <w:sz w:val="28"/>
+          <w:szCs w:val="28"/>
+        </w:rPr>
+        <w:t>.</w:t>
+      </w:r>
+    </w:p>
+    <w:p>
+      <w:pPr>
+        <w:spacing w:after="100"/>
+        <w:ind w:left="360"/>
+        <w:jc w:val="both"/>
+        <w:rPr>
+          <w:rFonts w:asciiTheme="majorBidi" w:hAnsiTheme="majorBidi" w:cstheme="majorBidi"/>
+          <w:sz w:val="28"/>
+          <w:szCs w:val="28"/>
+        </w:rPr>
+      </w:pPr>
+      <w:proofErr w:type="gramStart"/>
+      <w:r>
+        <w:rPr>
+          <w:rFonts w:asciiTheme="majorBidi" w:hAnsiTheme="majorBidi" w:cstheme="majorBidi"/>
+          <w:sz w:val="28"/>
+          <w:szCs w:val="28"/>
+        </w:rPr>
+        <w:lastRenderedPageBreak/>
+        <w:t>So</w:t>
+      </w:r>
+      <w:proofErr w:type="gramEnd"/>
+      <w:r>
+        <w:rPr>
+          <w:rFonts w:asciiTheme="majorBidi" w:hAnsiTheme="majorBidi" w:cstheme="majorBidi"/>
+          <w:sz w:val="28"/>
+          <w:szCs w:val="28"/>
+        </w:rPr>
+        <w:t xml:space="preserve"> there is usually a short overlap, not an instantaneous replacement. This overlap is one of the reasons </w:t>
+      </w:r>
+      <w:proofErr w:type="spellStart"/>
+      <w:r>
+        <w:rPr>
+          <w:rFonts w:asciiTheme="majorBidi" w:hAnsiTheme="majorBidi" w:cstheme="majorBidi"/>
+          <w:b/>
+          <w:bCs/>
+          <w:i/>
+          <w:iCs/>
+          <w:sz w:val="28"/>
+          <w:szCs w:val="28"/>
+        </w:rPr>
+        <w:t>maxSurge</w:t>
+      </w:r>
+      <w:proofErr w:type="spellEnd"/>
+      <w:r>
+        <w:rPr>
+          <w:rFonts w:asciiTheme="majorBidi" w:hAnsiTheme="majorBidi" w:cstheme="majorBidi"/>
+          <w:sz w:val="28"/>
+          <w:szCs w:val="28"/>
+        </w:rPr>
+        <w:t xml:space="preserve"> can provide a smoother update with minimal or no interruption in service.</w:t>
       </w:r>
     </w:p>
     <w:p>
@@ -5795,6 +6497,8 @@
           <w:rFonts w:asciiTheme="majorBidi" w:hAnsiTheme="majorBidi" w:cstheme="majorBidi"/>
           <w:b/>
           <w:bCs/>
+          <w:i/>
+          <w:iCs/>
           <w:sz w:val="36"/>
           <w:szCs w:val="36"/>
         </w:rPr>
@@ -5805,6 +6509,8 @@
           <w:rFonts w:asciiTheme="majorBidi" w:hAnsiTheme="majorBidi" w:cstheme="majorBidi"/>
           <w:b/>
           <w:bCs/>
+          <w:i/>
+          <w:iCs/>
           <w:sz w:val="36"/>
           <w:szCs w:val="36"/>
         </w:rPr>
@@ -5835,6 +6541,10 @@
       <w:r>
         <w:rPr>
           <w:rFonts w:asciiTheme="majorBidi" w:hAnsiTheme="majorBidi" w:cstheme="majorBidi"/>
+          <w:b/>
+          <w:bCs/>
+          <w:i/>
+          <w:iCs/>
           <w:sz w:val="28"/>
           <w:szCs w:val="28"/>
         </w:rPr>
@@ -5863,7 +6573,27 @@
           <w:sz w:val="28"/>
           <w:szCs w:val="28"/>
         </w:rPr>
-        <w:t>When you update the DaemonSet spec:</w:t>
+        <w:t xml:space="preserve">When you update the DaemonSet </w:t>
+      </w:r>
+      <w:r>
+        <w:rPr>
+          <w:rFonts w:asciiTheme="majorBidi" w:hAnsiTheme="majorBidi" w:cstheme="majorBidi"/>
+          <w:b/>
+          <w:bCs/>
+          <w:i/>
+          <w:iCs/>
+          <w:sz w:val="28"/>
+          <w:szCs w:val="28"/>
+        </w:rPr>
+        <w:t>spec</w:t>
+      </w:r>
+      <w:r>
+        <w:rPr>
+          <w:rFonts w:asciiTheme="majorBidi" w:hAnsiTheme="majorBidi" w:cstheme="majorBidi"/>
+          <w:sz w:val="28"/>
+          <w:szCs w:val="28"/>
+        </w:rPr>
+        <w:t>:</w:t>
       </w:r>
     </w:p>
     <w:p>
@@ -6451,7 +7181,6 @@
           <w:sz w:val="32"/>
           <w:szCs w:val="32"/>
         </w:rPr>
-        <w:lastRenderedPageBreak/>
         <w:t>RollingUpdate</w:t>
       </w:r>
       <w:proofErr w:type="spellEnd"/>
@@ -7201,6 +7930,7 @@
           <w:sz w:val="28"/>
           <w:szCs w:val="28"/>
         </w:rPr>
+        <w:lastRenderedPageBreak/>
         <w:t>RollingUpdate</w:t>
       </w:r>
       <w:proofErr w:type="spellEnd"/>
@@ -7253,177 +7983,25 @@
     </w:p>
     <w:p>
       <w:pPr>
-        <w:jc w:val="both"/>
-        <w:rPr>
-          <w:rFonts w:asciiTheme="majorBidi" w:hAnsiTheme="majorBidi" w:cstheme="majorBidi"/>
-          <w:sz w:val="28"/>
-          <w:szCs w:val="28"/>
-        </w:rPr>
-      </w:pPr>
-    </w:p>
-    <w:p>
-      <w:pPr>
-        <w:jc w:val="both"/>
-        <w:rPr>
-          <w:rFonts w:asciiTheme="majorBidi" w:hAnsiTheme="majorBidi" w:cstheme="majorBidi"/>
-          <w:sz w:val="28"/>
-          <w:szCs w:val="28"/>
-        </w:rPr>
-      </w:pPr>
-    </w:p>
-    <w:p>
-      <w:pPr>
-        <w:jc w:val="both"/>
-        <w:rPr>
-          <w:rFonts w:asciiTheme="majorBidi" w:hAnsiTheme="majorBidi" w:cstheme="majorBidi"/>
-          <w:sz w:val="28"/>
-          <w:szCs w:val="28"/>
-        </w:rPr>
-      </w:pPr>
-    </w:p>
-    <w:p>
-      <w:pPr>
-        <w:jc w:val="both"/>
-        <w:rPr>
-          <w:rFonts w:asciiTheme="majorBidi" w:hAnsiTheme="majorBidi" w:cstheme="majorBidi"/>
-          <w:sz w:val="28"/>
-          <w:szCs w:val="28"/>
-        </w:rPr>
-      </w:pPr>
-    </w:p>
-    <w:p>
-      <w:pPr>
-        <w:jc w:val="both"/>
-        <w:rPr>
-          <w:rFonts w:asciiTheme="majorBidi" w:hAnsiTheme="majorBidi" w:cstheme="majorBidi"/>
-          <w:sz w:val="28"/>
-          <w:szCs w:val="28"/>
-        </w:rPr>
-      </w:pPr>
-    </w:p>
-    <w:p>
-      <w:pPr>
         <w:spacing w:after="60"/>
         <w:jc w:val="both"/>
         <w:rPr>
           <w:rFonts w:asciiTheme="majorBidi" w:hAnsiTheme="majorBidi" w:cstheme="majorBidi"/>
           <w:b/>
           <w:bCs/>
-          <w:sz w:val="36"/>
-          <w:szCs w:val="36"/>
-        </w:rPr>
-      </w:pPr>
-    </w:p>
-    <w:p>
-      <w:pPr>
-        <w:spacing w:after="60"/>
-        <w:jc w:val="both"/>
-        <w:rPr>
-          <w:rFonts w:asciiTheme="majorBidi" w:hAnsiTheme="majorBidi" w:cstheme="majorBidi"/>
-          <w:b/>
-          <w:bCs/>
-          <w:sz w:val="36"/>
-          <w:szCs w:val="36"/>
-        </w:rPr>
-      </w:pPr>
-    </w:p>
-    <w:p>
-      <w:pPr>
-        <w:spacing w:after="60"/>
-        <w:jc w:val="both"/>
-        <w:rPr>
-          <w:rFonts w:asciiTheme="majorBidi" w:hAnsiTheme="majorBidi" w:cstheme="majorBidi"/>
-          <w:b/>
-          <w:bCs/>
-          <w:sz w:val="36"/>
-          <w:szCs w:val="36"/>
-        </w:rPr>
-      </w:pPr>
-    </w:p>
-    <w:p>
-      <w:pPr>
-        <w:spacing w:after="60"/>
-        <w:jc w:val="both"/>
-        <w:rPr>
-          <w:rFonts w:asciiTheme="majorBidi" w:hAnsiTheme="majorBidi" w:cstheme="majorBidi"/>
-          <w:b/>
-          <w:bCs/>
-          <w:sz w:val="36"/>
-          <w:szCs w:val="36"/>
-        </w:rPr>
-      </w:pPr>
-    </w:p>
-    <w:p>
-      <w:pPr>
-        <w:spacing w:after="60"/>
-        <w:jc w:val="both"/>
-        <w:rPr>
-          <w:rFonts w:asciiTheme="majorBidi" w:hAnsiTheme="majorBidi" w:cstheme="majorBidi"/>
-          <w:b/>
-          <w:bCs/>
-          <w:sz w:val="36"/>
-          <w:szCs w:val="36"/>
-        </w:rPr>
-      </w:pPr>
-    </w:p>
-    <w:p>
-      <w:pPr>
-        <w:spacing w:after="60"/>
-        <w:jc w:val="both"/>
-        <w:rPr>
-          <w:rFonts w:asciiTheme="majorBidi" w:hAnsiTheme="majorBidi" w:cstheme="majorBidi"/>
-          <w:b/>
-          <w:bCs/>
-          <w:sz w:val="36"/>
-          <w:szCs w:val="36"/>
-        </w:rPr>
-      </w:pPr>
-    </w:p>
-    <w:p>
-      <w:pPr>
-        <w:spacing w:after="60"/>
-        <w:jc w:val="both"/>
-        <w:rPr>
-          <w:rFonts w:asciiTheme="majorBidi" w:hAnsiTheme="majorBidi" w:cstheme="majorBidi"/>
-          <w:b/>
-          <w:bCs/>
-          <w:sz w:val="36"/>
-          <w:szCs w:val="36"/>
-        </w:rPr>
-      </w:pPr>
-    </w:p>
-    <w:p>
-      <w:pPr>
-        <w:spacing w:after="60"/>
-        <w:jc w:val="both"/>
-        <w:rPr>
-          <w:rFonts w:asciiTheme="majorBidi" w:hAnsiTheme="majorBidi" w:cstheme="majorBidi"/>
-          <w:b/>
-          <w:bCs/>
-          <w:sz w:val="36"/>
-          <w:szCs w:val="36"/>
-        </w:rPr>
-      </w:pPr>
-      <w:r>
-        <w:rPr>
-          <w:rFonts w:asciiTheme="majorBidi" w:hAnsiTheme="majorBidi" w:cstheme="majorBidi"/>
-          <w:b/>
-          <w:bCs/>
-          <w:sz w:val="36"/>
-          <w:szCs w:val="36"/>
-        </w:rPr>
-        <w:lastRenderedPageBreak/>
-        <w:t>Probes</w:t>
-      </w:r>
-      <w:r>
-        <w:rPr>
-          <w:rFonts w:asciiTheme="majorBidi" w:hAnsiTheme="majorBidi" w:cstheme="majorBidi"/>
-          <w:b/>
-          <w:bCs/>
-          <w:sz w:val="36"/>
-          <w:szCs w:val="36"/>
-        </w:rPr>
-        <w:t>:</w:t>
+          <w:sz w:val="40"/>
+          <w:szCs w:val="40"/>
+        </w:rPr>
+      </w:pPr>
+      <w:r>
+        <w:rPr>
+          <w:rFonts w:asciiTheme="majorBidi" w:hAnsiTheme="majorBidi" w:cstheme="majorBidi"/>
+          <w:b/>
+          <w:bCs/>
+          <w:sz w:val="40"/>
+          <w:szCs w:val="40"/>
+        </w:rPr>
+        <w:t>Probes:</w:t>
       </w:r>
     </w:p>
     <w:p>
@@ -9056,28 +9634,6 @@
         <w:jc w:val="both"/>
         <w:rPr>
           <w:rFonts w:asciiTheme="majorBidi" w:hAnsiTheme="majorBidi" w:cstheme="majorBidi"/>
-          <w:sz w:val="28"/>
-          <w:szCs w:val="28"/>
-        </w:rPr>
-      </w:pPr>
-    </w:p>
-    <w:p>
-      <w:pPr>
-        <w:jc w:val="both"/>
-        <w:rPr>
-          <w:rFonts w:asciiTheme="majorBidi" w:hAnsiTheme="majorBidi" w:cstheme="majorBidi"/>
-          <w:b/>
-          <w:bCs/>
-          <w:sz w:val="36"/>
-          <w:szCs w:val="36"/>
-        </w:rPr>
-      </w:pPr>
-    </w:p>
-    <w:p>
-      <w:pPr>
-        <w:jc w:val="both"/>
-        <w:rPr>
-          <w:rFonts w:asciiTheme="majorBidi" w:hAnsiTheme="majorBidi" w:cstheme="majorBidi"/>
           <w:b/>
           <w:bCs/>
           <w:sz w:val="36"/>
@@ -9932,7 +10488,7 @@
 </file>
 
 <file path=word/numbering.xml><?xml version="1.0" encoding="utf-8"?>
-<w:numbering xmlns:wpc="http://schemas.microsoft.com/office/word/2010/wordprocessingCanvas" xmlns:cx="http://schemas.microsoft.com/office/drawing/2014/chartex" xmlns:cx1="http://schemas.microsoft.com/office/drawing/2015/9/8/chartex" xmlns:cx2="http://schemas.microsoft.com/office/drawing/2015/10/21/chartex" xmlns:cx3="http://schemas.microsoft.com/office/drawing/2016/5/9/chartex" xmlns:cx4="http://schemas.microsoft.com/office/drawing/2016/5/10/chartex" xmlns:cx5="http://schemas.microsoft.com/office/drawing/2016/5/11/chartex" xmlns:cx6="http://schemas.microsoft.com/office/drawing/2016/5/12/chartex" xmlns:cx7="http://schemas.microsoft.com/office/drawing/2016/5/13/chartex" xmlns:cx8="http://schemas.microsoft.com/office/drawing/2016/5/14/chartex" xmlns:mc="http://schemas.openxmlformats.org/markup-compatibility/2006" xmlns:aink="http://schemas.microsoft.com/office/drawing/2016/ink" xmlns:am3d="http://schemas.microsoft.com/office/drawing/2017/model3d" xmlns:o="urn:schemas-microsoft-com:office:office" xmlns:oel="http://schemas.microsoft.com/office/2019/extlst" xmlns:r="http://schemas.openxmlformats.org/officeDocument/2006/relationships" xmlns:m="http://schemas.openxmlformats.org/officeDocument/2006/math" xmlns:v="urn:schemas-microsoft-com:vml" xmlns:wp14="http://schemas.microsoft.com/office/word/2010/wordprocessingDrawing" xmlns:wp="http://schemas.openxmlformats.org/drawingml/2006/wordprocessingDrawing" xmlns:w10="urn:schemas-microsoft-com:office:word" xmlns:w="http://schemas.openxmlformats.org/wordprocessingml/2006/main" xmlns:w14="http://schemas.microsoft.com/office/word/2010/wordml" xmlns:w15="http://schemas.microsoft.com/office/word/2012/wordml" xmlns:w16cex="http://schemas.microsoft.com/office/word/2018/wordml/cex" xmlns:w16cid="http://schemas.microsoft.com/office/word/2016/wordml/cid" xmlns:w16="http://schemas.microsoft.com/office/word/2018/wordml" xmlns:w16du="http://schemas.microsoft.com/office/word/2023/wordml/word16du" xmlns:w16sdtdh="http://schemas.microsoft.com/office/word/2020/wordml/sdtdatahash" xmlns:w16sdtfl="http://schemas.microsoft.com/office/word/2024/wordml/sdtformatlock" xmlns:w16se="http://schemas.microsoft.com/office/word/2015/wordml/symex" xmlns:wpg="http://schemas.microsoft.com/office/word/2010/wordprocessingGroup" xmlns:wpi="http://schemas.microsoft.com/office/word/2010/wordprocessingInk" xmlns:wne="http://schemas.microsoft.com/office/word/2006/wordml" xmlns:wps="http://schemas.microsoft.com/office/word/2010/wordprocessingShape" mc:Ignorable="w14 w15 w16se w16cid w16 w16cex w16sdtdh w16sdtfl w16du wp14">
+<w:numbering xmlns:wpc="http://schemas.microsoft.com/office/word/2010/wordprocessingCanvas" xmlns:cx="http://schemas.microsoft.com/office/drawing/2014/chartex" xmlns:cx1="http://schemas.microsoft.com/office/drawing/2015/9/8/chartex" xmlns:cx2="http://schemas.microsoft.com/office/drawing/2015/10/21/chartex" xmlns:cx3="http://schemas.microsoft.com/office/drawing/2016/5/9/chartex" xmlns:cx4="http://schemas.microsoft.com/office/drawing/2016/5/10/chartex" xmlns:cx5="http://schemas.microsoft.com/office/drawing/2016/5/11/chartex" xmlns:cx6="http://schemas.microsoft.com/office/drawing/2016/5/12/chartex" xmlns:cx7="http://schemas.microsoft.com/office/drawing/2016/5/13/chartex" xmlns:cx8="http://schemas.microsoft.com/office/drawing/2016/5/14/chartex" xmlns:mc="http://schemas.openxmlformats.org/markup-compatibility/2006" xmlns:aink="http://schemas.microsoft.com/office/drawing/2016/ink" xmlns:am3d="http://schemas.microsoft.com/office/drawing/2017/model3d" xmlns:o="urn:schemas-microsoft-com:office:office" xmlns:oel="http://schemas.microsoft.com/office/2019/extlst" xmlns:r="http://schemas.openxmlformats.org/officeDocument/2006/relationships" xmlns:m="http://schemas.openxmlformats.org/officeDocument/2006/math" xmlns:v="urn:schemas-microsoft-com:vml" xmlns:wp14="http://schemas.microsoft.com/office/word/2010/wordprocessingDrawing" xmlns:wp="http://schemas.openxmlformats.org/drawingml/2006/wordprocessingDrawing" xmlns:w10="urn:schemas-microsoft-com:office:word" xmlns:w="http://schemas.openxmlformats.org/wordprocessingml/2006/main" xmlns:w14="http://schemas.microsoft.com/office/word/2010/wordml" xmlns:w15="http://schemas.microsoft.com/office/word/2012/wordml" xmlns:w16cei="http://schemas.microsoft.com/office/word/2026/wordml/cei" xmlns:w16cex="http://schemas.microsoft.com/office/word/2018/wordml/cex" xmlns:w16cid="http://schemas.microsoft.com/office/word/2016/wordml/cid" xmlns:w16="http://schemas.microsoft.com/office/word/2018/wordml" xmlns:w16du="http://schemas.microsoft.com/office/word/2023/wordml/word16du" xmlns:w16sdtdh="http://schemas.microsoft.com/office/word/2020/wordml/sdtdatahash" xmlns:w16sdtfl="http://schemas.microsoft.com/office/word/2024/wordml/sdtformatlock" xmlns:w16se="http://schemas.microsoft.com/office/word/2015/wordml/symex" xmlns:wpg="http://schemas.microsoft.com/office/word/2010/wordprocessingGroup" xmlns:wpi="http://schemas.microsoft.com/office/word/2010/wordprocessingInk" xmlns:wne="http://schemas.microsoft.com/office/word/2006/wordml" xmlns:wps="http://schemas.microsoft.com/office/word/2010/wordprocessingShape" mc:Ignorable="w14 w15 w16se w16cid w16 w16cex w16sdtdh w16sdtfl w16du wp14">
   <w:abstractNum w:abstractNumId="0" w15:restartNumberingAfterBreak="0">
     <w:nsid w:val="06301D46"/>
     <w:multiLevelType w:val="hybridMultilevel"/>
@@ -12660,6 +13216,119 @@
       </w:pPr>
       <w:rPr>
         <w:rFonts w:ascii="Courier New" w:hAnsi="Courier New" w:cs="Courier New" w:hint="default"/>
+      </w:rPr>
+    </w:lvl>
+    <w:lvl w:ilvl="1" w:tplc="04090003" w:tentative="1">
+      <w:start w:val="1"/>
+      <w:numFmt w:val="bullet"/>
+      <w:lvlText w:val="o"/>
+      <w:lvlJc w:val="left"/>
+      <w:pPr>
+        <w:ind w:left="1800" w:hanging="360"/>
+      </w:pPr>
+      <w:rPr>
+        <w:rFonts w:ascii="Courier New" w:hAnsi="Courier New" w:cs="Courier New" w:hint="default"/>
+      </w:rPr>
+    </w:lvl>
+    <w:lvl w:ilvl="2" w:tplc="04090005" w:tentative="1">
+      <w:start w:val="1"/>
+      <w:numFmt w:val="bullet"/>
+      <w:lvlText w:val=""/>
+      <w:lvlJc w:val="left"/>
+      <w:pPr>
+        <w:ind w:left="2520" w:hanging="360"/>
+      </w:pPr>
+      <w:rPr>
+        <w:rFonts w:ascii="Wingdings" w:hAnsi="Wingdings" w:hint="default"/>
+      </w:rPr>
+    </w:lvl>
+    <w:lvl w:ilvl="3" w:tplc="04090001" w:tentative="1">
+      <w:start w:val="1"/>
+      <w:numFmt w:val="bullet"/>
+      <w:lvlText w:val=""/>
+      <w:lvlJc w:val="left"/>
+      <w:pPr>
+        <w:ind w:left="3240" w:hanging="360"/>
+      </w:pPr>
+      <w:rPr>
+        <w:rFonts w:ascii="Symbol" w:hAnsi="Symbol" w:hint="default"/>
+      </w:rPr>
+    </w:lvl>
+    <w:lvl w:ilvl="4" w:tplc="04090003" w:tentative="1">
+      <w:start w:val="1"/>
+      <w:numFmt w:val="bullet"/>
+      <w:lvlText w:val="o"/>
+      <w:lvlJc w:val="left"/>
+      <w:pPr>
+        <w:ind w:left="3960" w:hanging="360"/>
+      </w:pPr>
+      <w:rPr>
+        <w:rFonts w:ascii="Courier New" w:hAnsi="Courier New" w:cs="Courier New" w:hint="default"/>
+      </w:rPr>
+    </w:lvl>
+    <w:lvl w:ilvl="5" w:tplc="04090005" w:tentative="1">
+      <w:start w:val="1"/>
+      <w:numFmt w:val="bullet"/>
+      <w:lvlText w:val=""/>
+      <w:lvlJc w:val="left"/>
+      <w:pPr>
+        <w:ind w:left="4680" w:hanging="360"/>
+      </w:pPr>
+      <w:rPr>
+        <w:rFonts w:ascii="Wingdings" w:hAnsi="Wingdings" w:hint="default"/>
+      </w:rPr>
+    </w:lvl>
+    <w:lvl w:ilvl="6" w:tplc="04090001" w:tentative="1">
+      <w:start w:val="1"/>
+      <w:numFmt w:val="bullet"/>
+      <w:lvlText w:val=""/>
+      <w:lvlJc w:val="left"/>
+      <w:pPr>
+        <w:ind w:left="5400" w:hanging="360"/>
+      </w:pPr>
+      <w:rPr>
+        <w:rFonts w:ascii="Symbol" w:hAnsi="Symbol" w:hint="default"/>
+      </w:rPr>
+    </w:lvl>
+    <w:lvl w:ilvl="7" w:tplc="04090003" w:tentative="1">
+      <w:start w:val="1"/>
+      <w:numFmt w:val="bullet"/>
+      <w:lvlText w:val="o"/>
+      <w:lvlJc w:val="left"/>
+      <w:pPr>
+        <w:ind w:left="6120" w:hanging="360"/>
+      </w:pPr>
+      <w:rPr>
+        <w:rFonts w:ascii="Courier New" w:hAnsi="Courier New" w:cs="Courier New" w:hint="default"/>
+      </w:rPr>
+    </w:lvl>
+    <w:lvl w:ilvl="8" w:tplc="04090005" w:tentative="1">
+      <w:start w:val="1"/>
+      <w:numFmt w:val="bullet"/>
+      <w:lvlText w:val=""/>
+      <w:lvlJc w:val="left"/>
+      <w:pPr>
+        <w:ind w:left="6840" w:hanging="360"/>
+      </w:pPr>
+      <w:rPr>
+        <w:rFonts w:ascii="Wingdings" w:hAnsi="Wingdings" w:hint="default"/>
+      </w:rPr>
+    </w:lvl>
+  </w:abstractNum>
+  <w:abstractNum w:abstractNumId="26" w15:restartNumberingAfterBreak="0">
+    <w:nsid w:val="789405BE"/>
+    <w:multiLevelType w:val="hybridMultilevel"/>
+    <w:tmpl w:val="070483A0"/>
+    <w:lvl w:ilvl="0" w:tplc="0409000D">
+      <w:start w:val="1"/>
+      <w:numFmt w:val="bullet"/>
+      <w:lvlText w:val=""/>
+      <w:lvlJc w:val="left"/>
+      <w:pPr>
+        <w:ind w:left="1080" w:hanging="360"/>
+      </w:pPr>
+      <w:rPr>
+        <w:rFonts w:ascii="Wingdings" w:hAnsi="Wingdings" w:hint="default"/>
       </w:rPr>
     </w:lvl>
     <w:lvl w:ilvl="1" w:tplc="04090003" w:tentative="1">
@@ -12836,6 +13505,9 @@
   </w:num>
   <w:num w:numId="26" w16cid:durableId="1959985714">
     <w:abstractNumId w:val="23"/>
+  </w:num>
+  <w:num w:numId="27" w16cid:durableId="1306741367">
+    <w:abstractNumId w:val="26"/>
   </w:num>
 </w:numbering>
 </file>

</xml_diff>